<commit_message>
Use continuous Q&A numbering across the Transport FAQ
Numbering previously restarted at Q1 in each subcategory, so labels repeated
14 times over. Q&A pairs now run Q1-Q191 continuously through the document,
giving every entry a unique reference.

Co-Authored-By: Claude Opus 5 <noreply@anthropic.com>
Claude-Session: https://claude.ai/code/session_01CyJRDCSC3pzoJ4gAtg3ACM
</commit_message>
<xml_diff>
--- a/Grab_FAQ_Transport_Branded.docx
+++ b/Grab_FAQ_Transport_Branded.docx
@@ -426,7 +426,7 @@
           <w:color w:val="007D38"/>
           <w:sz w:val="21"/>
         </w:rPr>
-        <w:t xml:space="preserve">Q1. </w:t>
+        <w:t xml:space="preserve">Q6. </w:t>
       </w:r>
       <w:r>
         <w:rPr>
@@ -447,7 +447,7 @@
           <w:color w:val="007D38"/>
           <w:sz w:val="21"/>
         </w:rPr>
-        <w:t xml:space="preserve">A1. </w:t>
+        <w:t xml:space="preserve">A6. </w:t>
       </w:r>
       <w:r>
         <w:rPr>
@@ -551,7 +551,7 @@
           <w:color w:val="007D38"/>
           <w:sz w:val="21"/>
         </w:rPr>
-        <w:t xml:space="preserve">Q2. </w:t>
+        <w:t xml:space="preserve">Q7. </w:t>
       </w:r>
       <w:r>
         <w:rPr>
@@ -572,7 +572,7 @@
           <w:color w:val="007D38"/>
           <w:sz w:val="21"/>
         </w:rPr>
-        <w:t xml:space="preserve">A2. </w:t>
+        <w:t xml:space="preserve">A7. </w:t>
       </w:r>
       <w:r>
         <w:rPr>
@@ -634,7 +634,7 @@
           <w:color w:val="007D38"/>
           <w:sz w:val="21"/>
         </w:rPr>
-        <w:t xml:space="preserve">Q3. </w:t>
+        <w:t xml:space="preserve">Q8. </w:t>
       </w:r>
       <w:r>
         <w:rPr>
@@ -655,7 +655,7 @@
           <w:color w:val="007D38"/>
           <w:sz w:val="21"/>
         </w:rPr>
-        <w:t xml:space="preserve">A3. </w:t>
+        <w:t xml:space="preserve">A8. </w:t>
       </w:r>
       <w:r>
         <w:rPr>
@@ -675,7 +675,7 @@
           <w:color w:val="007D38"/>
           <w:sz w:val="21"/>
         </w:rPr>
-        <w:t xml:space="preserve">Q4. </w:t>
+        <w:t xml:space="preserve">Q9. </w:t>
       </w:r>
       <w:r>
         <w:rPr>
@@ -696,7 +696,7 @@
           <w:color w:val="007D38"/>
           <w:sz w:val="21"/>
         </w:rPr>
-        <w:t xml:space="preserve">A4. </w:t>
+        <w:t xml:space="preserve">A9. </w:t>
       </w:r>
       <w:r>
         <w:rPr>
@@ -716,7 +716,7 @@
           <w:color w:val="007D38"/>
           <w:sz w:val="21"/>
         </w:rPr>
-        <w:t xml:space="preserve">Q5. </w:t>
+        <w:t xml:space="preserve">Q10. </w:t>
       </w:r>
       <w:r>
         <w:rPr>
@@ -737,7 +737,7 @@
           <w:color w:val="007D38"/>
           <w:sz w:val="21"/>
         </w:rPr>
-        <w:t xml:space="preserve">A5. </w:t>
+        <w:t xml:space="preserve">A10. </w:t>
       </w:r>
       <w:r>
         <w:rPr>
@@ -799,7 +799,7 @@
           <w:color w:val="007D38"/>
           <w:sz w:val="21"/>
         </w:rPr>
-        <w:t xml:space="preserve">Q6. </w:t>
+        <w:t xml:space="preserve">Q11. </w:t>
       </w:r>
       <w:r>
         <w:rPr>
@@ -820,7 +820,7 @@
           <w:color w:val="007D38"/>
           <w:sz w:val="21"/>
         </w:rPr>
-        <w:t xml:space="preserve">A6. </w:t>
+        <w:t xml:space="preserve">A11. </w:t>
       </w:r>
       <w:r>
         <w:rPr>
@@ -840,7 +840,7 @@
           <w:color w:val="007D38"/>
           <w:sz w:val="21"/>
         </w:rPr>
-        <w:t xml:space="preserve">Q7. </w:t>
+        <w:t xml:space="preserve">Q12. </w:t>
       </w:r>
       <w:r>
         <w:rPr>
@@ -861,7 +861,7 @@
           <w:color w:val="007D38"/>
           <w:sz w:val="21"/>
         </w:rPr>
-        <w:t xml:space="preserve">A7. </w:t>
+        <w:t xml:space="preserve">A12. </w:t>
       </w:r>
       <w:r>
         <w:rPr>
@@ -881,7 +881,7 @@
           <w:color w:val="007D38"/>
           <w:sz w:val="21"/>
         </w:rPr>
-        <w:t xml:space="preserve">Q8. </w:t>
+        <w:t xml:space="preserve">Q13. </w:t>
       </w:r>
       <w:r>
         <w:rPr>
@@ -902,7 +902,7 @@
           <w:color w:val="007D38"/>
           <w:sz w:val="21"/>
         </w:rPr>
-        <w:t xml:space="preserve">A8. </w:t>
+        <w:t xml:space="preserve">A13. </w:t>
       </w:r>
       <w:r>
         <w:rPr>
@@ -922,7 +922,7 @@
           <w:color w:val="007D38"/>
           <w:sz w:val="21"/>
         </w:rPr>
-        <w:t xml:space="preserve">Q9. </w:t>
+        <w:t xml:space="preserve">Q14. </w:t>
       </w:r>
       <w:r>
         <w:rPr>
@@ -943,7 +943,7 @@
           <w:color w:val="007D38"/>
           <w:sz w:val="21"/>
         </w:rPr>
-        <w:t xml:space="preserve">A9. </w:t>
+        <w:t xml:space="preserve">A14. </w:t>
       </w:r>
       <w:r>
         <w:rPr>
@@ -963,7 +963,7 @@
           <w:color w:val="007D38"/>
           <w:sz w:val="21"/>
         </w:rPr>
-        <w:t xml:space="preserve">Q10. </w:t>
+        <w:t xml:space="preserve">Q15. </w:t>
       </w:r>
       <w:r>
         <w:rPr>
@@ -984,7 +984,7 @@
           <w:color w:val="007D38"/>
           <w:sz w:val="21"/>
         </w:rPr>
-        <w:t xml:space="preserve">A10. </w:t>
+        <w:t xml:space="preserve">A15. </w:t>
       </w:r>
       <w:r>
         <w:rPr>
@@ -1004,7 +1004,7 @@
           <w:color w:val="007D38"/>
           <w:sz w:val="21"/>
         </w:rPr>
-        <w:t xml:space="preserve">Q11. </w:t>
+        <w:t xml:space="preserve">Q16. </w:t>
       </w:r>
       <w:r>
         <w:rPr>
@@ -1025,7 +1025,7 @@
           <w:color w:val="007D38"/>
           <w:sz w:val="21"/>
         </w:rPr>
-        <w:t xml:space="preserve">A11. </w:t>
+        <w:t xml:space="preserve">A16. </w:t>
       </w:r>
       <w:r>
         <w:rPr>
@@ -1045,7 +1045,7 @@
           <w:color w:val="007D38"/>
           <w:sz w:val="21"/>
         </w:rPr>
-        <w:t xml:space="preserve">Q12. </w:t>
+        <w:t xml:space="preserve">Q17. </w:t>
       </w:r>
       <w:r>
         <w:rPr>
@@ -1066,7 +1066,7 @@
           <w:color w:val="007D38"/>
           <w:sz w:val="21"/>
         </w:rPr>
-        <w:t xml:space="preserve">A12. </w:t>
+        <w:t xml:space="preserve">A17. </w:t>
       </w:r>
       <w:r>
         <w:rPr>
@@ -1086,7 +1086,7 @@
           <w:color w:val="007D38"/>
           <w:sz w:val="21"/>
         </w:rPr>
-        <w:t xml:space="preserve">Q13. </w:t>
+        <w:t xml:space="preserve">Q18. </w:t>
       </w:r>
       <w:r>
         <w:rPr>
@@ -1107,7 +1107,7 @@
           <w:color w:val="007D38"/>
           <w:sz w:val="21"/>
         </w:rPr>
-        <w:t xml:space="preserve">A13. </w:t>
+        <w:t xml:space="preserve">A18. </w:t>
       </w:r>
       <w:r>
         <w:rPr>
@@ -1127,7 +1127,7 @@
           <w:color w:val="007D38"/>
           <w:sz w:val="21"/>
         </w:rPr>
-        <w:t xml:space="preserve">Q14. </w:t>
+        <w:t xml:space="preserve">Q19. </w:t>
       </w:r>
       <w:r>
         <w:rPr>
@@ -1148,7 +1148,7 @@
           <w:color w:val="007D38"/>
           <w:sz w:val="21"/>
         </w:rPr>
-        <w:t xml:space="preserve">A14. </w:t>
+        <w:t xml:space="preserve">A19. </w:t>
       </w:r>
       <w:r>
         <w:rPr>
@@ -1168,7 +1168,7 @@
           <w:color w:val="007D38"/>
           <w:sz w:val="21"/>
         </w:rPr>
-        <w:t xml:space="preserve">Q15. </w:t>
+        <w:t xml:space="preserve">Q20. </w:t>
       </w:r>
       <w:r>
         <w:rPr>
@@ -1189,7 +1189,7 @@
           <w:color w:val="007D38"/>
           <w:sz w:val="21"/>
         </w:rPr>
-        <w:t xml:space="preserve">A15. </w:t>
+        <w:t xml:space="preserve">A20. </w:t>
       </w:r>
       <w:r>
         <w:rPr>
@@ -1293,7 +1293,7 @@
           <w:color w:val="007D38"/>
           <w:sz w:val="21"/>
         </w:rPr>
-        <w:t xml:space="preserve">Q16. </w:t>
+        <w:t xml:space="preserve">Q21. </w:t>
       </w:r>
       <w:r>
         <w:rPr>
@@ -1314,7 +1314,7 @@
           <w:color w:val="007D38"/>
           <w:sz w:val="21"/>
         </w:rPr>
-        <w:t xml:space="preserve">A16. </w:t>
+        <w:t xml:space="preserve">A21. </w:t>
       </w:r>
       <w:r>
         <w:rPr>
@@ -1334,7 +1334,7 @@
           <w:color w:val="007D38"/>
           <w:sz w:val="21"/>
         </w:rPr>
-        <w:t xml:space="preserve">Q17. </w:t>
+        <w:t xml:space="preserve">Q22. </w:t>
       </w:r>
       <w:r>
         <w:rPr>
@@ -1355,7 +1355,7 @@
           <w:color w:val="007D38"/>
           <w:sz w:val="21"/>
         </w:rPr>
-        <w:t xml:space="preserve">A17. </w:t>
+        <w:t xml:space="preserve">A22. </w:t>
       </w:r>
       <w:r>
         <w:rPr>
@@ -1445,7 +1445,7 @@
           <w:color w:val="007D38"/>
           <w:sz w:val="21"/>
         </w:rPr>
-        <w:t xml:space="preserve">Q18. </w:t>
+        <w:t xml:space="preserve">Q23. </w:t>
       </w:r>
       <w:r>
         <w:rPr>
@@ -1466,7 +1466,7 @@
           <w:color w:val="007D38"/>
           <w:sz w:val="21"/>
         </w:rPr>
-        <w:t xml:space="preserve">A18. </w:t>
+        <w:t xml:space="preserve">A23. </w:t>
       </w:r>
       <w:r>
         <w:rPr>
@@ -1486,7 +1486,7 @@
           <w:color w:val="007D38"/>
           <w:sz w:val="21"/>
         </w:rPr>
-        <w:t xml:space="preserve">Q19. </w:t>
+        <w:t xml:space="preserve">Q24. </w:t>
       </w:r>
       <w:r>
         <w:rPr>
@@ -1507,7 +1507,7 @@
           <w:color w:val="007D38"/>
           <w:sz w:val="21"/>
         </w:rPr>
-        <w:t xml:space="preserve">A19. </w:t>
+        <w:t xml:space="preserve">A24. </w:t>
       </w:r>
       <w:r>
         <w:rPr>
@@ -1527,7 +1527,7 @@
           <w:color w:val="007D38"/>
           <w:sz w:val="21"/>
         </w:rPr>
-        <w:t xml:space="preserve">Q20. </w:t>
+        <w:t xml:space="preserve">Q25. </w:t>
       </w:r>
       <w:r>
         <w:rPr>
@@ -1548,7 +1548,7 @@
           <w:color w:val="007D38"/>
           <w:sz w:val="21"/>
         </w:rPr>
-        <w:t xml:space="preserve">A20. </w:t>
+        <w:t xml:space="preserve">A25. </w:t>
       </w:r>
       <w:r>
         <w:rPr>
@@ -1568,7 +1568,7 @@
           <w:color w:val="007D38"/>
           <w:sz w:val="21"/>
         </w:rPr>
-        <w:t xml:space="preserve">Q21. </w:t>
+        <w:t xml:space="preserve">Q26. </w:t>
       </w:r>
       <w:r>
         <w:rPr>
@@ -1589,7 +1589,7 @@
           <w:color w:val="007D38"/>
           <w:sz w:val="21"/>
         </w:rPr>
-        <w:t xml:space="preserve">A21. </w:t>
+        <w:t xml:space="preserve">A26. </w:t>
       </w:r>
       <w:r>
         <w:rPr>
@@ -1609,7 +1609,7 @@
           <w:color w:val="007D38"/>
           <w:sz w:val="21"/>
         </w:rPr>
-        <w:t xml:space="preserve">Q22. </w:t>
+        <w:t xml:space="preserve">Q27. </w:t>
       </w:r>
       <w:r>
         <w:rPr>
@@ -1630,7 +1630,7 @@
           <w:color w:val="007D38"/>
           <w:sz w:val="21"/>
         </w:rPr>
-        <w:t xml:space="preserve">A22. </w:t>
+        <w:t xml:space="preserve">A27. </w:t>
       </w:r>
       <w:r>
         <w:rPr>
@@ -1650,7 +1650,7 @@
           <w:color w:val="007D38"/>
           <w:sz w:val="21"/>
         </w:rPr>
-        <w:t xml:space="preserve">Q23. </w:t>
+        <w:t xml:space="preserve">Q28. </w:t>
       </w:r>
       <w:r>
         <w:rPr>
@@ -1671,7 +1671,7 @@
           <w:color w:val="007D38"/>
           <w:sz w:val="21"/>
         </w:rPr>
-        <w:t xml:space="preserve">A23. </w:t>
+        <w:t xml:space="preserve">A28. </w:t>
       </w:r>
       <w:r>
         <w:rPr>
@@ -1691,7 +1691,7 @@
           <w:color w:val="007D38"/>
           <w:sz w:val="21"/>
         </w:rPr>
-        <w:t xml:space="preserve">Q24. </w:t>
+        <w:t xml:space="preserve">Q29. </w:t>
       </w:r>
       <w:r>
         <w:rPr>
@@ -1712,7 +1712,7 @@
           <w:color w:val="007D38"/>
           <w:sz w:val="21"/>
         </w:rPr>
-        <w:t xml:space="preserve">A24. </w:t>
+        <w:t xml:space="preserve">A29. </w:t>
       </w:r>
       <w:r>
         <w:rPr>
@@ -1732,7 +1732,7 @@
           <w:color w:val="007D38"/>
           <w:sz w:val="21"/>
         </w:rPr>
-        <w:t xml:space="preserve">Q25. </w:t>
+        <w:t xml:space="preserve">Q30. </w:t>
       </w:r>
       <w:r>
         <w:rPr>
@@ -1753,7 +1753,7 @@
           <w:color w:val="007D38"/>
           <w:sz w:val="21"/>
         </w:rPr>
-        <w:t xml:space="preserve">A25. </w:t>
+        <w:t xml:space="preserve">A30. </w:t>
       </w:r>
       <w:r>
         <w:rPr>
@@ -1773,7 +1773,7 @@
           <w:color w:val="007D38"/>
           <w:sz w:val="21"/>
         </w:rPr>
-        <w:t xml:space="preserve">Q26. </w:t>
+        <w:t xml:space="preserve">Q31. </w:t>
       </w:r>
       <w:r>
         <w:rPr>
@@ -1794,7 +1794,7 @@
           <w:color w:val="007D38"/>
           <w:sz w:val="21"/>
         </w:rPr>
-        <w:t xml:space="preserve">A26. </w:t>
+        <w:t xml:space="preserve">A31. </w:t>
       </w:r>
       <w:r>
         <w:rPr>
@@ -1814,7 +1814,7 @@
           <w:color w:val="007D38"/>
           <w:sz w:val="21"/>
         </w:rPr>
-        <w:t xml:space="preserve">Q27. </w:t>
+        <w:t xml:space="preserve">Q32. </w:t>
       </w:r>
       <w:r>
         <w:rPr>
@@ -1835,7 +1835,7 @@
           <w:color w:val="007D38"/>
           <w:sz w:val="21"/>
         </w:rPr>
-        <w:t xml:space="preserve">A27. </w:t>
+        <w:t xml:space="preserve">A32. </w:t>
       </w:r>
       <w:r>
         <w:rPr>
@@ -1855,7 +1855,7 @@
           <w:color w:val="007D38"/>
           <w:sz w:val="21"/>
         </w:rPr>
-        <w:t xml:space="preserve">Q28. </w:t>
+        <w:t xml:space="preserve">Q33. </w:t>
       </w:r>
       <w:r>
         <w:rPr>
@@ -1876,7 +1876,7 @@
           <w:color w:val="007D38"/>
           <w:sz w:val="21"/>
         </w:rPr>
-        <w:t xml:space="preserve">A28. </w:t>
+        <w:t xml:space="preserve">A33. </w:t>
       </w:r>
       <w:r>
         <w:rPr>
@@ -1961,7 +1961,7 @@
           <w:color w:val="007D38"/>
           <w:sz w:val="21"/>
         </w:rPr>
-        <w:t xml:space="preserve">Q1. </w:t>
+        <w:t xml:space="preserve">Q34. </w:t>
       </w:r>
       <w:r>
         <w:rPr>
@@ -1982,7 +1982,7 @@
           <w:color w:val="007D38"/>
           <w:sz w:val="21"/>
         </w:rPr>
-        <w:t xml:space="preserve">A1. </w:t>
+        <w:t xml:space="preserve">A34. </w:t>
       </w:r>
       <w:r>
         <w:rPr>
@@ -2002,7 +2002,7 @@
           <w:color w:val="007D38"/>
           <w:sz w:val="21"/>
         </w:rPr>
-        <w:t xml:space="preserve">Q2. </w:t>
+        <w:t xml:space="preserve">Q35. </w:t>
       </w:r>
       <w:r>
         <w:rPr>
@@ -2023,7 +2023,7 @@
           <w:color w:val="007D38"/>
           <w:sz w:val="21"/>
         </w:rPr>
-        <w:t xml:space="preserve">A2. </w:t>
+        <w:t xml:space="preserve">A35. </w:t>
       </w:r>
       <w:r>
         <w:rPr>
@@ -2043,7 +2043,7 @@
           <w:color w:val="007D38"/>
           <w:sz w:val="21"/>
         </w:rPr>
-        <w:t xml:space="preserve">Q3. </w:t>
+        <w:t xml:space="preserve">Q36. </w:t>
       </w:r>
       <w:r>
         <w:rPr>
@@ -2064,7 +2064,7 @@
           <w:color w:val="007D38"/>
           <w:sz w:val="21"/>
         </w:rPr>
-        <w:t xml:space="preserve">A3. </w:t>
+        <w:t xml:space="preserve">A36. </w:t>
       </w:r>
       <w:r>
         <w:rPr>
@@ -2084,7 +2084,7 @@
           <w:color w:val="007D38"/>
           <w:sz w:val="21"/>
         </w:rPr>
-        <w:t xml:space="preserve">Q4. </w:t>
+        <w:t xml:space="preserve">Q37. </w:t>
       </w:r>
       <w:r>
         <w:rPr>
@@ -2105,7 +2105,7 @@
           <w:color w:val="007D38"/>
           <w:sz w:val="21"/>
         </w:rPr>
-        <w:t xml:space="preserve">A4. </w:t>
+        <w:t xml:space="preserve">A37. </w:t>
       </w:r>
       <w:r>
         <w:rPr>
@@ -2125,7 +2125,7 @@
           <w:color w:val="007D38"/>
           <w:sz w:val="21"/>
         </w:rPr>
-        <w:t xml:space="preserve">Q5. </w:t>
+        <w:t xml:space="preserve">Q38. </w:t>
       </w:r>
       <w:r>
         <w:rPr>
@@ -2146,7 +2146,7 @@
           <w:color w:val="007D38"/>
           <w:sz w:val="21"/>
         </w:rPr>
-        <w:t xml:space="preserve">A5. </w:t>
+        <w:t xml:space="preserve">A38. </w:t>
       </w:r>
       <w:r>
         <w:rPr>
@@ -2166,7 +2166,7 @@
           <w:color w:val="007D38"/>
           <w:sz w:val="21"/>
         </w:rPr>
-        <w:t xml:space="preserve">Q6. </w:t>
+        <w:t xml:space="preserve">Q39. </w:t>
       </w:r>
       <w:r>
         <w:rPr>
@@ -2187,7 +2187,7 @@
           <w:color w:val="007D38"/>
           <w:sz w:val="21"/>
         </w:rPr>
-        <w:t xml:space="preserve">A6. </w:t>
+        <w:t xml:space="preserve">A39. </w:t>
       </w:r>
       <w:r>
         <w:rPr>
@@ -2207,7 +2207,7 @@
           <w:color w:val="007D38"/>
           <w:sz w:val="21"/>
         </w:rPr>
-        <w:t xml:space="preserve">Q7. </w:t>
+        <w:t xml:space="preserve">Q40. </w:t>
       </w:r>
       <w:r>
         <w:rPr>
@@ -2228,7 +2228,7 @@
           <w:color w:val="007D38"/>
           <w:sz w:val="21"/>
         </w:rPr>
-        <w:t xml:space="preserve">A7. </w:t>
+        <w:t xml:space="preserve">A40. </w:t>
       </w:r>
       <w:r>
         <w:rPr>
@@ -2248,7 +2248,7 @@
           <w:color w:val="007D38"/>
           <w:sz w:val="21"/>
         </w:rPr>
-        <w:t xml:space="preserve">Q8. </w:t>
+        <w:t xml:space="preserve">Q41. </w:t>
       </w:r>
       <w:r>
         <w:rPr>
@@ -2269,7 +2269,7 @@
           <w:color w:val="007D38"/>
           <w:sz w:val="21"/>
         </w:rPr>
-        <w:t xml:space="preserve">A8. </w:t>
+        <w:t xml:space="preserve">A41. </w:t>
       </w:r>
       <w:r>
         <w:rPr>
@@ -2289,7 +2289,7 @@
           <w:color w:val="007D38"/>
           <w:sz w:val="21"/>
         </w:rPr>
-        <w:t xml:space="preserve">Q9. </w:t>
+        <w:t xml:space="preserve">Q42. </w:t>
       </w:r>
       <w:r>
         <w:rPr>
@@ -2310,7 +2310,7 @@
           <w:color w:val="007D38"/>
           <w:sz w:val="21"/>
         </w:rPr>
-        <w:t xml:space="preserve">A9. </w:t>
+        <w:t xml:space="preserve">A42. </w:t>
       </w:r>
       <w:r>
         <w:rPr>
@@ -2330,7 +2330,7 @@
           <w:color w:val="007D38"/>
           <w:sz w:val="21"/>
         </w:rPr>
-        <w:t xml:space="preserve">Q10. </w:t>
+        <w:t xml:space="preserve">Q43. </w:t>
       </w:r>
       <w:r>
         <w:rPr>
@@ -2351,7 +2351,7 @@
           <w:color w:val="007D38"/>
           <w:sz w:val="21"/>
         </w:rPr>
-        <w:t xml:space="preserve">A10. </w:t>
+        <w:t xml:space="preserve">A43. </w:t>
       </w:r>
       <w:r>
         <w:rPr>
@@ -2371,7 +2371,7 @@
           <w:color w:val="007D38"/>
           <w:sz w:val="21"/>
         </w:rPr>
-        <w:t xml:space="preserve">Q11. </w:t>
+        <w:t xml:space="preserve">Q44. </w:t>
       </w:r>
       <w:r>
         <w:rPr>
@@ -2392,7 +2392,7 @@
           <w:color w:val="007D38"/>
           <w:sz w:val="21"/>
         </w:rPr>
-        <w:t xml:space="preserve">A11. </w:t>
+        <w:t xml:space="preserve">A44. </w:t>
       </w:r>
       <w:r>
         <w:rPr>
@@ -2412,7 +2412,7 @@
           <w:color w:val="007D38"/>
           <w:sz w:val="21"/>
         </w:rPr>
-        <w:t xml:space="preserve">Q12. </w:t>
+        <w:t xml:space="preserve">Q45. </w:t>
       </w:r>
       <w:r>
         <w:rPr>
@@ -2433,7 +2433,7 @@
           <w:color w:val="007D38"/>
           <w:sz w:val="21"/>
         </w:rPr>
-        <w:t xml:space="preserve">A12. </w:t>
+        <w:t xml:space="preserve">A45. </w:t>
       </w:r>
       <w:r>
         <w:rPr>
@@ -2453,7 +2453,7 @@
           <w:color w:val="007D38"/>
           <w:sz w:val="21"/>
         </w:rPr>
-        <w:t xml:space="preserve">Q13. </w:t>
+        <w:t xml:space="preserve">Q46. </w:t>
       </w:r>
       <w:r>
         <w:rPr>
@@ -2474,7 +2474,7 @@
           <w:color w:val="007D38"/>
           <w:sz w:val="21"/>
         </w:rPr>
-        <w:t xml:space="preserve">A13. </w:t>
+        <w:t xml:space="preserve">A46. </w:t>
       </w:r>
       <w:r>
         <w:rPr>
@@ -2494,7 +2494,7 @@
           <w:color w:val="007D38"/>
           <w:sz w:val="21"/>
         </w:rPr>
-        <w:t xml:space="preserve">Q14. </w:t>
+        <w:t xml:space="preserve">Q47. </w:t>
       </w:r>
       <w:r>
         <w:rPr>
@@ -2515,7 +2515,7 @@
           <w:color w:val="007D38"/>
           <w:sz w:val="21"/>
         </w:rPr>
-        <w:t xml:space="preserve">A14. </w:t>
+        <w:t xml:space="preserve">A47. </w:t>
       </w:r>
       <w:r>
         <w:rPr>
@@ -2535,7 +2535,7 @@
           <w:color w:val="007D38"/>
           <w:sz w:val="21"/>
         </w:rPr>
-        <w:t xml:space="preserve">Q15. </w:t>
+        <w:t xml:space="preserve">Q48. </w:t>
       </w:r>
       <w:r>
         <w:rPr>
@@ -2556,7 +2556,7 @@
           <w:color w:val="007D38"/>
           <w:sz w:val="21"/>
         </w:rPr>
-        <w:t xml:space="preserve">A15. </w:t>
+        <w:t xml:space="preserve">A48. </w:t>
       </w:r>
       <w:r>
         <w:rPr>
@@ -2576,7 +2576,7 @@
           <w:color w:val="007D38"/>
           <w:sz w:val="21"/>
         </w:rPr>
-        <w:t xml:space="preserve">Q16. </w:t>
+        <w:t xml:space="preserve">Q49. </w:t>
       </w:r>
       <w:r>
         <w:rPr>
@@ -2597,7 +2597,7 @@
           <w:color w:val="007D38"/>
           <w:sz w:val="21"/>
         </w:rPr>
-        <w:t xml:space="preserve">A16. </w:t>
+        <w:t xml:space="preserve">A49. </w:t>
       </w:r>
       <w:r>
         <w:rPr>
@@ -2617,7 +2617,7 @@
           <w:color w:val="007D38"/>
           <w:sz w:val="21"/>
         </w:rPr>
-        <w:t xml:space="preserve">Q17. </w:t>
+        <w:t xml:space="preserve">Q50. </w:t>
       </w:r>
       <w:r>
         <w:rPr>
@@ -2638,7 +2638,7 @@
           <w:color w:val="007D38"/>
           <w:sz w:val="21"/>
         </w:rPr>
-        <w:t xml:space="preserve">A17. </w:t>
+        <w:t xml:space="preserve">A50. </w:t>
       </w:r>
       <w:r>
         <w:rPr>
@@ -2658,7 +2658,7 @@
           <w:color w:val="007D38"/>
           <w:sz w:val="21"/>
         </w:rPr>
-        <w:t xml:space="preserve">Q18. </w:t>
+        <w:t xml:space="preserve">Q51. </w:t>
       </w:r>
       <w:r>
         <w:rPr>
@@ -2679,7 +2679,7 @@
           <w:color w:val="007D38"/>
           <w:sz w:val="21"/>
         </w:rPr>
-        <w:t xml:space="preserve">A18. </w:t>
+        <w:t xml:space="preserve">A51. </w:t>
       </w:r>
       <w:r>
         <w:rPr>
@@ -2699,7 +2699,7 @@
           <w:color w:val="007D38"/>
           <w:sz w:val="21"/>
         </w:rPr>
-        <w:t xml:space="preserve">Q19. </w:t>
+        <w:t xml:space="preserve">Q52. </w:t>
       </w:r>
       <w:r>
         <w:rPr>
@@ -2720,7 +2720,7 @@
           <w:color w:val="007D38"/>
           <w:sz w:val="21"/>
         </w:rPr>
-        <w:t xml:space="preserve">A19. </w:t>
+        <w:t xml:space="preserve">A52. </w:t>
       </w:r>
       <w:r>
         <w:rPr>
@@ -2740,7 +2740,7 @@
           <w:color w:val="007D38"/>
           <w:sz w:val="21"/>
         </w:rPr>
-        <w:t xml:space="preserve">Q20. </w:t>
+        <w:t xml:space="preserve">Q53. </w:t>
       </w:r>
       <w:r>
         <w:rPr>
@@ -2761,7 +2761,7 @@
           <w:color w:val="007D38"/>
           <w:sz w:val="21"/>
         </w:rPr>
-        <w:t xml:space="preserve">A20. </w:t>
+        <w:t xml:space="preserve">A53. </w:t>
       </w:r>
       <w:r>
         <w:rPr>
@@ -2781,7 +2781,7 @@
           <w:color w:val="007D38"/>
           <w:sz w:val="21"/>
         </w:rPr>
-        <w:t xml:space="preserve">Q21. </w:t>
+        <w:t xml:space="preserve">Q54. </w:t>
       </w:r>
       <w:r>
         <w:rPr>
@@ -2802,7 +2802,7 @@
           <w:color w:val="007D38"/>
           <w:sz w:val="21"/>
         </w:rPr>
-        <w:t xml:space="preserve">A21. </w:t>
+        <w:t xml:space="preserve">A54. </w:t>
       </w:r>
       <w:r>
         <w:rPr>
@@ -2822,7 +2822,7 @@
           <w:color w:val="007D38"/>
           <w:sz w:val="21"/>
         </w:rPr>
-        <w:t xml:space="preserve">Q22. </w:t>
+        <w:t xml:space="preserve">Q55. </w:t>
       </w:r>
       <w:r>
         <w:rPr>
@@ -2843,7 +2843,7 @@
           <w:color w:val="007D38"/>
           <w:sz w:val="21"/>
         </w:rPr>
-        <w:t xml:space="preserve">A22. </w:t>
+        <w:t xml:space="preserve">A55. </w:t>
       </w:r>
       <w:r>
         <w:rPr>
@@ -2863,7 +2863,7 @@
           <w:color w:val="007D38"/>
           <w:sz w:val="21"/>
         </w:rPr>
-        <w:t xml:space="preserve">Q23. </w:t>
+        <w:t xml:space="preserve">Q56. </w:t>
       </w:r>
       <w:r>
         <w:rPr>
@@ -2884,7 +2884,7 @@
           <w:color w:val="007D38"/>
           <w:sz w:val="21"/>
         </w:rPr>
-        <w:t xml:space="preserve">A23. </w:t>
+        <w:t xml:space="preserve">A56. </w:t>
       </w:r>
       <w:r>
         <w:rPr>
@@ -2904,7 +2904,7 @@
           <w:color w:val="007D38"/>
           <w:sz w:val="21"/>
         </w:rPr>
-        <w:t xml:space="preserve">Q24. </w:t>
+        <w:t xml:space="preserve">Q57. </w:t>
       </w:r>
       <w:r>
         <w:rPr>
@@ -2925,7 +2925,7 @@
           <w:color w:val="007D38"/>
           <w:sz w:val="21"/>
         </w:rPr>
-        <w:t xml:space="preserve">A24. </w:t>
+        <w:t xml:space="preserve">A57. </w:t>
       </w:r>
       <w:r>
         <w:rPr>
@@ -3010,7 +3010,7 @@
           <w:color w:val="007D38"/>
           <w:sz w:val="21"/>
         </w:rPr>
-        <w:t xml:space="preserve">Q1. </w:t>
+        <w:t xml:space="preserve">Q58. </w:t>
       </w:r>
       <w:r>
         <w:rPr>
@@ -3031,7 +3031,7 @@
           <w:color w:val="007D38"/>
           <w:sz w:val="21"/>
         </w:rPr>
-        <w:t xml:space="preserve">A1. </w:t>
+        <w:t xml:space="preserve">A58. </w:t>
       </w:r>
       <w:r>
         <w:rPr>
@@ -3051,7 +3051,7 @@
           <w:color w:val="007D38"/>
           <w:sz w:val="21"/>
         </w:rPr>
-        <w:t xml:space="preserve">Q2. </w:t>
+        <w:t xml:space="preserve">Q59. </w:t>
       </w:r>
       <w:r>
         <w:rPr>
@@ -3072,7 +3072,7 @@
           <w:color w:val="007D38"/>
           <w:sz w:val="21"/>
         </w:rPr>
-        <w:t xml:space="preserve">A2. </w:t>
+        <w:t xml:space="preserve">A59. </w:t>
       </w:r>
       <w:r>
         <w:rPr>
@@ -3092,7 +3092,7 @@
           <w:color w:val="007D38"/>
           <w:sz w:val="21"/>
         </w:rPr>
-        <w:t xml:space="preserve">Q3. </w:t>
+        <w:t xml:space="preserve">Q60. </w:t>
       </w:r>
       <w:r>
         <w:rPr>
@@ -3113,7 +3113,7 @@
           <w:color w:val="007D38"/>
           <w:sz w:val="21"/>
         </w:rPr>
-        <w:t xml:space="preserve">A3. </w:t>
+        <w:t xml:space="preserve">A60. </w:t>
       </w:r>
       <w:r>
         <w:rPr>
@@ -3133,7 +3133,7 @@
           <w:color w:val="007D38"/>
           <w:sz w:val="21"/>
         </w:rPr>
-        <w:t xml:space="preserve">Q4. </w:t>
+        <w:t xml:space="preserve">Q61. </w:t>
       </w:r>
       <w:r>
         <w:rPr>
@@ -3154,7 +3154,7 @@
           <w:color w:val="007D38"/>
           <w:sz w:val="21"/>
         </w:rPr>
-        <w:t xml:space="preserve">A4. </w:t>
+        <w:t xml:space="preserve">A61. </w:t>
       </w:r>
       <w:r>
         <w:rPr>
@@ -3174,7 +3174,7 @@
           <w:color w:val="007D38"/>
           <w:sz w:val="21"/>
         </w:rPr>
-        <w:t xml:space="preserve">Q5. </w:t>
+        <w:t xml:space="preserve">Q62. </w:t>
       </w:r>
       <w:r>
         <w:rPr>
@@ -3195,7 +3195,7 @@
           <w:color w:val="007D38"/>
           <w:sz w:val="21"/>
         </w:rPr>
-        <w:t xml:space="preserve">A5. </w:t>
+        <w:t xml:space="preserve">A62. </w:t>
       </w:r>
       <w:r>
         <w:rPr>
@@ -3215,7 +3215,7 @@
           <w:color w:val="007D38"/>
           <w:sz w:val="21"/>
         </w:rPr>
-        <w:t xml:space="preserve">Q6. </w:t>
+        <w:t xml:space="preserve">Q63. </w:t>
       </w:r>
       <w:r>
         <w:rPr>
@@ -3236,7 +3236,7 @@
           <w:color w:val="007D38"/>
           <w:sz w:val="21"/>
         </w:rPr>
-        <w:t xml:space="preserve">A6. </w:t>
+        <w:t xml:space="preserve">A63. </w:t>
       </w:r>
       <w:r>
         <w:rPr>
@@ -3256,7 +3256,7 @@
           <w:color w:val="007D38"/>
           <w:sz w:val="21"/>
         </w:rPr>
-        <w:t xml:space="preserve">Q7. </w:t>
+        <w:t xml:space="preserve">Q64. </w:t>
       </w:r>
       <w:r>
         <w:rPr>
@@ -3277,7 +3277,7 @@
           <w:color w:val="007D38"/>
           <w:sz w:val="21"/>
         </w:rPr>
-        <w:t xml:space="preserve">A7. </w:t>
+        <w:t xml:space="preserve">A64. </w:t>
       </w:r>
       <w:r>
         <w:rPr>
@@ -3297,7 +3297,7 @@
           <w:color w:val="007D38"/>
           <w:sz w:val="21"/>
         </w:rPr>
-        <w:t xml:space="preserve">Q8. </w:t>
+        <w:t xml:space="preserve">Q65. </w:t>
       </w:r>
       <w:r>
         <w:rPr>
@@ -3318,7 +3318,7 @@
           <w:color w:val="007D38"/>
           <w:sz w:val="21"/>
         </w:rPr>
-        <w:t xml:space="preserve">A8. </w:t>
+        <w:t xml:space="preserve">A65. </w:t>
       </w:r>
       <w:r>
         <w:rPr>
@@ -3487,7 +3487,7 @@
           <w:color w:val="007D38"/>
           <w:sz w:val="21"/>
         </w:rPr>
-        <w:t xml:space="preserve">Q1. </w:t>
+        <w:t xml:space="preserve">Q66. </w:t>
       </w:r>
       <w:r>
         <w:rPr>
@@ -3508,7 +3508,7 @@
           <w:color w:val="007D38"/>
           <w:sz w:val="21"/>
         </w:rPr>
-        <w:t xml:space="preserve">A1. </w:t>
+        <w:t xml:space="preserve">A66. </w:t>
       </w:r>
       <w:r>
         <w:rPr>
@@ -3528,7 +3528,7 @@
           <w:color w:val="007D38"/>
           <w:sz w:val="21"/>
         </w:rPr>
-        <w:t xml:space="preserve">Q2. </w:t>
+        <w:t xml:space="preserve">Q67. </w:t>
       </w:r>
       <w:r>
         <w:rPr>
@@ -3549,7 +3549,7 @@
           <w:color w:val="007D38"/>
           <w:sz w:val="21"/>
         </w:rPr>
-        <w:t xml:space="preserve">A2. </w:t>
+        <w:t xml:space="preserve">A67. </w:t>
       </w:r>
       <w:r>
         <w:rPr>
@@ -3569,7 +3569,7 @@
           <w:color w:val="007D38"/>
           <w:sz w:val="21"/>
         </w:rPr>
-        <w:t xml:space="preserve">Q3. </w:t>
+        <w:t xml:space="preserve">Q68. </w:t>
       </w:r>
       <w:r>
         <w:rPr>
@@ -3590,7 +3590,7 @@
           <w:color w:val="007D38"/>
           <w:sz w:val="21"/>
         </w:rPr>
-        <w:t xml:space="preserve">A3. </w:t>
+        <w:t xml:space="preserve">A68. </w:t>
       </w:r>
       <w:r>
         <w:rPr>
@@ -3666,7 +3666,7 @@
           <w:color w:val="007D38"/>
           <w:sz w:val="21"/>
         </w:rPr>
-        <w:t xml:space="preserve">Q4. </w:t>
+        <w:t xml:space="preserve">Q69. </w:t>
       </w:r>
       <w:r>
         <w:rPr>
@@ -3687,7 +3687,7 @@
           <w:color w:val="007D38"/>
           <w:sz w:val="21"/>
         </w:rPr>
-        <w:t xml:space="preserve">A4. </w:t>
+        <w:t xml:space="preserve">A69. </w:t>
       </w:r>
       <w:r>
         <w:rPr>
@@ -3707,7 +3707,7 @@
           <w:color w:val="007D38"/>
           <w:sz w:val="21"/>
         </w:rPr>
-        <w:t xml:space="preserve">Q5. </w:t>
+        <w:t xml:space="preserve">Q70. </w:t>
       </w:r>
       <w:r>
         <w:rPr>
@@ -3728,7 +3728,7 @@
           <w:color w:val="007D38"/>
           <w:sz w:val="21"/>
         </w:rPr>
-        <w:t xml:space="preserve">A5. </w:t>
+        <w:t xml:space="preserve">A70. </w:t>
       </w:r>
       <w:r>
         <w:rPr>
@@ -3748,7 +3748,7 @@
           <w:color w:val="007D38"/>
           <w:sz w:val="21"/>
         </w:rPr>
-        <w:t xml:space="preserve">Q6. </w:t>
+        <w:t xml:space="preserve">Q71. </w:t>
       </w:r>
       <w:r>
         <w:rPr>
@@ -3769,7 +3769,7 @@
           <w:color w:val="007D38"/>
           <w:sz w:val="21"/>
         </w:rPr>
-        <w:t xml:space="preserve">A6. </w:t>
+        <w:t xml:space="preserve">A71. </w:t>
       </w:r>
       <w:r>
         <w:rPr>
@@ -3924,7 +3924,7 @@
           <w:color w:val="007D38"/>
           <w:sz w:val="21"/>
         </w:rPr>
-        <w:t xml:space="preserve">Q1. </w:t>
+        <w:t xml:space="preserve">Q72. </w:t>
       </w:r>
       <w:r>
         <w:rPr>
@@ -3945,7 +3945,7 @@
           <w:color w:val="007D38"/>
           <w:sz w:val="21"/>
         </w:rPr>
-        <w:t xml:space="preserve">A1. </w:t>
+        <w:t xml:space="preserve">A72. </w:t>
       </w:r>
       <w:r>
         <w:rPr>
@@ -4063,7 +4063,7 @@
           <w:color w:val="007D38"/>
           <w:sz w:val="21"/>
         </w:rPr>
-        <w:t xml:space="preserve">Q2. </w:t>
+        <w:t xml:space="preserve">Q73. </w:t>
       </w:r>
       <w:r>
         <w:rPr>
@@ -4084,7 +4084,7 @@
           <w:color w:val="007D38"/>
           <w:sz w:val="21"/>
         </w:rPr>
-        <w:t xml:space="preserve">A2. </w:t>
+        <w:t xml:space="preserve">A73. </w:t>
       </w:r>
       <w:r>
         <w:rPr>
@@ -4104,7 +4104,7 @@
           <w:color w:val="007D38"/>
           <w:sz w:val="21"/>
         </w:rPr>
-        <w:t xml:space="preserve">Q3. </w:t>
+        <w:t xml:space="preserve">Q74. </w:t>
       </w:r>
       <w:r>
         <w:rPr>
@@ -4125,7 +4125,7 @@
           <w:color w:val="007D38"/>
           <w:sz w:val="21"/>
         </w:rPr>
-        <w:t xml:space="preserve">A3. </w:t>
+        <w:t xml:space="preserve">A74. </w:t>
       </w:r>
       <w:r>
         <w:rPr>
@@ -4201,7 +4201,7 @@
           <w:color w:val="007D38"/>
           <w:sz w:val="21"/>
         </w:rPr>
-        <w:t xml:space="preserve">Q4. </w:t>
+        <w:t xml:space="preserve">Q75. </w:t>
       </w:r>
       <w:r>
         <w:rPr>
@@ -4222,7 +4222,7 @@
           <w:color w:val="007D38"/>
           <w:sz w:val="21"/>
         </w:rPr>
-        <w:t xml:space="preserve">A4. </w:t>
+        <w:t xml:space="preserve">A75. </w:t>
       </w:r>
       <w:r>
         <w:rPr>
@@ -4242,7 +4242,7 @@
           <w:color w:val="007D38"/>
           <w:sz w:val="21"/>
         </w:rPr>
-        <w:t xml:space="preserve">Q5. </w:t>
+        <w:t xml:space="preserve">Q76. </w:t>
       </w:r>
       <w:r>
         <w:rPr>
@@ -4263,7 +4263,7 @@
           <w:color w:val="007D38"/>
           <w:sz w:val="21"/>
         </w:rPr>
-        <w:t xml:space="preserve">A5. </w:t>
+        <w:t xml:space="preserve">A76. </w:t>
       </w:r>
       <w:r>
         <w:rPr>
@@ -4283,7 +4283,7 @@
           <w:color w:val="007D38"/>
           <w:sz w:val="21"/>
         </w:rPr>
-        <w:t xml:space="preserve">Q6. </w:t>
+        <w:t xml:space="preserve">Q77. </w:t>
       </w:r>
       <w:r>
         <w:rPr>
@@ -4304,7 +4304,7 @@
           <w:color w:val="007D38"/>
           <w:sz w:val="21"/>
         </w:rPr>
-        <w:t xml:space="preserve">A6. </w:t>
+        <w:t xml:space="preserve">A77. </w:t>
       </w:r>
       <w:r>
         <w:rPr>
@@ -4422,7 +4422,7 @@
           <w:color w:val="007D38"/>
           <w:sz w:val="21"/>
         </w:rPr>
-        <w:t xml:space="preserve">Q7. </w:t>
+        <w:t xml:space="preserve">Q78. </w:t>
       </w:r>
       <w:r>
         <w:rPr>
@@ -4443,7 +4443,7 @@
           <w:color w:val="007D38"/>
           <w:sz w:val="21"/>
         </w:rPr>
-        <w:t xml:space="preserve">A7. </w:t>
+        <w:t xml:space="preserve">A78. </w:t>
       </w:r>
       <w:r>
         <w:rPr>
@@ -4463,7 +4463,7 @@
           <w:color w:val="007D38"/>
           <w:sz w:val="21"/>
         </w:rPr>
-        <w:t xml:space="preserve">Q8. </w:t>
+        <w:t xml:space="preserve">Q79. </w:t>
       </w:r>
       <w:r>
         <w:rPr>
@@ -4484,7 +4484,7 @@
           <w:color w:val="007D38"/>
           <w:sz w:val="21"/>
         </w:rPr>
-        <w:t xml:space="preserve">A8. </w:t>
+        <w:t xml:space="preserve">A79. </w:t>
       </w:r>
       <w:r>
         <w:rPr>
@@ -4504,7 +4504,7 @@
           <w:color w:val="007D38"/>
           <w:sz w:val="21"/>
         </w:rPr>
-        <w:t xml:space="preserve">Q9. </w:t>
+        <w:t xml:space="preserve">Q80. </w:t>
       </w:r>
       <w:r>
         <w:rPr>
@@ -4525,7 +4525,7 @@
           <w:color w:val="007D38"/>
           <w:sz w:val="21"/>
         </w:rPr>
-        <w:t xml:space="preserve">A9. </w:t>
+        <w:t xml:space="preserve">A80. </w:t>
       </w:r>
       <w:r>
         <w:rPr>
@@ -4545,7 +4545,7 @@
           <w:color w:val="007D38"/>
           <w:sz w:val="21"/>
         </w:rPr>
-        <w:t xml:space="preserve">Q10. </w:t>
+        <w:t xml:space="preserve">Q81. </w:t>
       </w:r>
       <w:r>
         <w:rPr>
@@ -4566,7 +4566,7 @@
           <w:color w:val="007D38"/>
           <w:sz w:val="21"/>
         </w:rPr>
-        <w:t xml:space="preserve">A10. </w:t>
+        <w:t xml:space="preserve">A81. </w:t>
       </w:r>
       <w:r>
         <w:rPr>
@@ -4586,7 +4586,7 @@
           <w:color w:val="007D38"/>
           <w:sz w:val="21"/>
         </w:rPr>
-        <w:t xml:space="preserve">Q11. </w:t>
+        <w:t xml:space="preserve">Q82. </w:t>
       </w:r>
       <w:r>
         <w:rPr>
@@ -4607,7 +4607,7 @@
           <w:color w:val="007D38"/>
           <w:sz w:val="21"/>
         </w:rPr>
-        <w:t xml:space="preserve">A11. </w:t>
+        <w:t xml:space="preserve">A82. </w:t>
       </w:r>
       <w:r>
         <w:rPr>
@@ -4627,7 +4627,7 @@
           <w:color w:val="007D38"/>
           <w:sz w:val="21"/>
         </w:rPr>
-        <w:t xml:space="preserve">Q12. </w:t>
+        <w:t xml:space="preserve">Q83. </w:t>
       </w:r>
       <w:r>
         <w:rPr>
@@ -4648,7 +4648,7 @@
           <w:color w:val="007D38"/>
           <w:sz w:val="21"/>
         </w:rPr>
-        <w:t xml:space="preserve">A12. </w:t>
+        <w:t xml:space="preserve">A83. </w:t>
       </w:r>
       <w:r>
         <w:rPr>
@@ -4668,7 +4668,7 @@
           <w:color w:val="007D38"/>
           <w:sz w:val="21"/>
         </w:rPr>
-        <w:t xml:space="preserve">Q13. </w:t>
+        <w:t xml:space="preserve">Q84. </w:t>
       </w:r>
       <w:r>
         <w:rPr>
@@ -4689,7 +4689,7 @@
           <w:color w:val="007D38"/>
           <w:sz w:val="21"/>
         </w:rPr>
-        <w:t xml:space="preserve">A13. </w:t>
+        <w:t xml:space="preserve">A84. </w:t>
       </w:r>
       <w:r>
         <w:rPr>
@@ -4709,7 +4709,7 @@
           <w:color w:val="007D38"/>
           <w:sz w:val="21"/>
         </w:rPr>
-        <w:t xml:space="preserve">Q14. </w:t>
+        <w:t xml:space="preserve">Q85. </w:t>
       </w:r>
       <w:r>
         <w:rPr>
@@ -4730,7 +4730,7 @@
           <w:color w:val="007D38"/>
           <w:sz w:val="21"/>
         </w:rPr>
-        <w:t xml:space="preserve">A14. </w:t>
+        <w:t xml:space="preserve">A85. </w:t>
       </w:r>
       <w:r>
         <w:rPr>
@@ -4750,7 +4750,7 @@
           <w:color w:val="007D38"/>
           <w:sz w:val="21"/>
         </w:rPr>
-        <w:t xml:space="preserve">Q15. </w:t>
+        <w:t xml:space="preserve">Q86. </w:t>
       </w:r>
       <w:r>
         <w:rPr>
@@ -4771,7 +4771,7 @@
           <w:color w:val="007D38"/>
           <w:sz w:val="21"/>
         </w:rPr>
-        <w:t xml:space="preserve">A15. </w:t>
+        <w:t xml:space="preserve">A86. </w:t>
       </w:r>
       <w:r>
         <w:rPr>
@@ -4791,7 +4791,7 @@
           <w:color w:val="007D38"/>
           <w:sz w:val="21"/>
         </w:rPr>
-        <w:t xml:space="preserve">Q16. </w:t>
+        <w:t xml:space="preserve">Q87. </w:t>
       </w:r>
       <w:r>
         <w:rPr>
@@ -4812,7 +4812,7 @@
           <w:color w:val="007D38"/>
           <w:sz w:val="21"/>
         </w:rPr>
-        <w:t xml:space="preserve">A16. </w:t>
+        <w:t xml:space="preserve">A87. </w:t>
       </w:r>
       <w:r>
         <w:rPr>
@@ -4874,7 +4874,7 @@
           <w:color w:val="007D38"/>
           <w:sz w:val="21"/>
         </w:rPr>
-        <w:t xml:space="preserve">Q17. </w:t>
+        <w:t xml:space="preserve">Q88. </w:t>
       </w:r>
       <w:r>
         <w:rPr>
@@ -4895,7 +4895,7 @@
           <w:color w:val="007D38"/>
           <w:sz w:val="21"/>
         </w:rPr>
-        <w:t xml:space="preserve">A17. </w:t>
+        <w:t xml:space="preserve">A88. </w:t>
       </w:r>
       <w:r>
         <w:rPr>
@@ -4999,7 +4999,7 @@
           <w:color w:val="007D38"/>
           <w:sz w:val="21"/>
         </w:rPr>
-        <w:t xml:space="preserve">Q18. </w:t>
+        <w:t xml:space="preserve">Q89. </w:t>
       </w:r>
       <w:r>
         <w:rPr>
@@ -5020,7 +5020,7 @@
           <w:color w:val="007D38"/>
           <w:sz w:val="21"/>
         </w:rPr>
-        <w:t xml:space="preserve">A18. </w:t>
+        <w:t xml:space="preserve">A89. </w:t>
       </w:r>
       <w:r>
         <w:rPr>
@@ -5040,7 +5040,7 @@
           <w:color w:val="007D38"/>
           <w:sz w:val="21"/>
         </w:rPr>
-        <w:t xml:space="preserve">Q19. </w:t>
+        <w:t xml:space="preserve">Q90. </w:t>
       </w:r>
       <w:r>
         <w:rPr>
@@ -5061,7 +5061,7 @@
           <w:color w:val="007D38"/>
           <w:sz w:val="21"/>
         </w:rPr>
-        <w:t xml:space="preserve">A19. </w:t>
+        <w:t xml:space="preserve">A90. </w:t>
       </w:r>
       <w:r>
         <w:rPr>
@@ -5081,7 +5081,7 @@
           <w:color w:val="007D38"/>
           <w:sz w:val="21"/>
         </w:rPr>
-        <w:t xml:space="preserve">Q20. </w:t>
+        <w:t xml:space="preserve">Q91. </w:t>
       </w:r>
       <w:r>
         <w:rPr>
@@ -5102,7 +5102,7 @@
           <w:color w:val="007D38"/>
           <w:sz w:val="21"/>
         </w:rPr>
-        <w:t xml:space="preserve">A20. </w:t>
+        <w:t xml:space="preserve">A91. </w:t>
       </w:r>
       <w:r>
         <w:rPr>
@@ -5187,7 +5187,7 @@
           <w:color w:val="007D38"/>
           <w:sz w:val="21"/>
         </w:rPr>
-        <w:t xml:space="preserve">Q1. </w:t>
+        <w:t xml:space="preserve">Q92. </w:t>
       </w:r>
       <w:r>
         <w:rPr>
@@ -5208,7 +5208,7 @@
           <w:color w:val="007D38"/>
           <w:sz w:val="21"/>
         </w:rPr>
-        <w:t xml:space="preserve">A1. </w:t>
+        <w:t xml:space="preserve">A92. </w:t>
       </w:r>
       <w:r>
         <w:rPr>
@@ -5228,7 +5228,7 @@
           <w:color w:val="007D38"/>
           <w:sz w:val="21"/>
         </w:rPr>
-        <w:t xml:space="preserve">Q2. </w:t>
+        <w:t xml:space="preserve">Q93. </w:t>
       </w:r>
       <w:r>
         <w:rPr>
@@ -5249,7 +5249,7 @@
           <w:color w:val="007D38"/>
           <w:sz w:val="21"/>
         </w:rPr>
-        <w:t xml:space="preserve">A2. </w:t>
+        <w:t xml:space="preserve">A93. </w:t>
       </w:r>
       <w:r>
         <w:rPr>
@@ -5269,7 +5269,7 @@
           <w:color w:val="007D38"/>
           <w:sz w:val="21"/>
         </w:rPr>
-        <w:t xml:space="preserve">Q3. </w:t>
+        <w:t xml:space="preserve">Q94. </w:t>
       </w:r>
       <w:r>
         <w:rPr>
@@ -5290,7 +5290,7 @@
           <w:color w:val="007D38"/>
           <w:sz w:val="21"/>
         </w:rPr>
-        <w:t xml:space="preserve">A3. </w:t>
+        <w:t xml:space="preserve">A94. </w:t>
       </w:r>
       <w:r>
         <w:rPr>
@@ -5310,7 +5310,7 @@
           <w:color w:val="007D38"/>
           <w:sz w:val="21"/>
         </w:rPr>
-        <w:t xml:space="preserve">Q4. </w:t>
+        <w:t xml:space="preserve">Q95. </w:t>
       </w:r>
       <w:r>
         <w:rPr>
@@ -5331,7 +5331,7 @@
           <w:color w:val="007D38"/>
           <w:sz w:val="21"/>
         </w:rPr>
-        <w:t xml:space="preserve">A4. </w:t>
+        <w:t xml:space="preserve">A95. </w:t>
       </w:r>
       <w:r>
         <w:rPr>
@@ -5351,7 +5351,7 @@
           <w:color w:val="007D38"/>
           <w:sz w:val="21"/>
         </w:rPr>
-        <w:t xml:space="preserve">Q5. </w:t>
+        <w:t xml:space="preserve">Q96. </w:t>
       </w:r>
       <w:r>
         <w:rPr>
@@ -5372,7 +5372,7 @@
           <w:color w:val="007D38"/>
           <w:sz w:val="21"/>
         </w:rPr>
-        <w:t xml:space="preserve">A5. </w:t>
+        <w:t xml:space="preserve">A96. </w:t>
       </w:r>
       <w:r>
         <w:rPr>
@@ -5392,7 +5392,7 @@
           <w:color w:val="007D38"/>
           <w:sz w:val="21"/>
         </w:rPr>
-        <w:t xml:space="preserve">Q6. </w:t>
+        <w:t xml:space="preserve">Q97. </w:t>
       </w:r>
       <w:r>
         <w:rPr>
@@ -5413,7 +5413,7 @@
           <w:color w:val="007D38"/>
           <w:sz w:val="21"/>
         </w:rPr>
-        <w:t xml:space="preserve">A6. </w:t>
+        <w:t xml:space="preserve">A97. </w:t>
       </w:r>
       <w:r>
         <w:rPr>
@@ -5433,7 +5433,7 @@
           <w:color w:val="007D38"/>
           <w:sz w:val="21"/>
         </w:rPr>
-        <w:t xml:space="preserve">Q7. </w:t>
+        <w:t xml:space="preserve">Q98. </w:t>
       </w:r>
       <w:r>
         <w:rPr>
@@ -5454,7 +5454,7 @@
           <w:color w:val="007D38"/>
           <w:sz w:val="21"/>
         </w:rPr>
-        <w:t xml:space="preserve">A7. </w:t>
+        <w:t xml:space="preserve">A98. </w:t>
       </w:r>
       <w:r>
         <w:rPr>
@@ -5474,7 +5474,7 @@
           <w:color w:val="007D38"/>
           <w:sz w:val="21"/>
         </w:rPr>
-        <w:t xml:space="preserve">Q8. </w:t>
+        <w:t xml:space="preserve">Q99. </w:t>
       </w:r>
       <w:r>
         <w:rPr>
@@ -5495,7 +5495,7 @@
           <w:color w:val="007D38"/>
           <w:sz w:val="21"/>
         </w:rPr>
-        <w:t xml:space="preserve">A8. </w:t>
+        <w:t xml:space="preserve">A99. </w:t>
       </w:r>
       <w:r>
         <w:rPr>
@@ -5515,7 +5515,7 @@
           <w:color w:val="007D38"/>
           <w:sz w:val="21"/>
         </w:rPr>
-        <w:t xml:space="preserve">Q9. </w:t>
+        <w:t xml:space="preserve">Q100. </w:t>
       </w:r>
       <w:r>
         <w:rPr>
@@ -5536,7 +5536,7 @@
           <w:color w:val="007D38"/>
           <w:sz w:val="21"/>
         </w:rPr>
-        <w:t xml:space="preserve">A9. </w:t>
+        <w:t xml:space="preserve">A100. </w:t>
       </w:r>
       <w:r>
         <w:rPr>
@@ -5556,7 +5556,7 @@
           <w:color w:val="007D38"/>
           <w:sz w:val="21"/>
         </w:rPr>
-        <w:t xml:space="preserve">Q10. </w:t>
+        <w:t xml:space="preserve">Q101. </w:t>
       </w:r>
       <w:r>
         <w:rPr>
@@ -5577,7 +5577,7 @@
           <w:color w:val="007D38"/>
           <w:sz w:val="21"/>
         </w:rPr>
-        <w:t xml:space="preserve">A10. </w:t>
+        <w:t xml:space="preserve">A101. </w:t>
       </w:r>
       <w:r>
         <w:rPr>
@@ -5597,7 +5597,7 @@
           <w:color w:val="007D38"/>
           <w:sz w:val="21"/>
         </w:rPr>
-        <w:t xml:space="preserve">Q11. </w:t>
+        <w:t xml:space="preserve">Q102. </w:t>
       </w:r>
       <w:r>
         <w:rPr>
@@ -5618,7 +5618,7 @@
           <w:color w:val="007D38"/>
           <w:sz w:val="21"/>
         </w:rPr>
-        <w:t xml:space="preserve">A11. </w:t>
+        <w:t xml:space="preserve">A102. </w:t>
       </w:r>
       <w:r>
         <w:rPr>
@@ -5638,7 +5638,7 @@
           <w:color w:val="007D38"/>
           <w:sz w:val="21"/>
         </w:rPr>
-        <w:t xml:space="preserve">Q12. </w:t>
+        <w:t xml:space="preserve">Q103. </w:t>
       </w:r>
       <w:r>
         <w:rPr>
@@ -5659,7 +5659,7 @@
           <w:color w:val="007D38"/>
           <w:sz w:val="21"/>
         </w:rPr>
-        <w:t xml:space="preserve">A12. </w:t>
+        <w:t xml:space="preserve">A103. </w:t>
       </w:r>
       <w:r>
         <w:rPr>
@@ -5679,7 +5679,7 @@
           <w:color w:val="007D38"/>
           <w:sz w:val="21"/>
         </w:rPr>
-        <w:t xml:space="preserve">Q13. </w:t>
+        <w:t xml:space="preserve">Q104. </w:t>
       </w:r>
       <w:r>
         <w:rPr>
@@ -5700,7 +5700,7 @@
           <w:color w:val="007D38"/>
           <w:sz w:val="21"/>
         </w:rPr>
-        <w:t xml:space="preserve">A13. </w:t>
+        <w:t xml:space="preserve">A104. </w:t>
       </w:r>
       <w:r>
         <w:rPr>
@@ -5720,7 +5720,7 @@
           <w:color w:val="007D38"/>
           <w:sz w:val="21"/>
         </w:rPr>
-        <w:t xml:space="preserve">Q14. </w:t>
+        <w:t xml:space="preserve">Q105. </w:t>
       </w:r>
       <w:r>
         <w:rPr>
@@ -5741,7 +5741,7 @@
           <w:color w:val="007D38"/>
           <w:sz w:val="21"/>
         </w:rPr>
-        <w:t xml:space="preserve">A14. </w:t>
+        <w:t xml:space="preserve">A105. </w:t>
       </w:r>
       <w:r>
         <w:rPr>
@@ -5761,7 +5761,7 @@
           <w:color w:val="007D38"/>
           <w:sz w:val="21"/>
         </w:rPr>
-        <w:t xml:space="preserve">Q15. </w:t>
+        <w:t xml:space="preserve">Q106. </w:t>
       </w:r>
       <w:r>
         <w:rPr>
@@ -5782,7 +5782,7 @@
           <w:color w:val="007D38"/>
           <w:sz w:val="21"/>
         </w:rPr>
-        <w:t xml:space="preserve">A15. </w:t>
+        <w:t xml:space="preserve">A106. </w:t>
       </w:r>
       <w:r>
         <w:rPr>
@@ -5802,7 +5802,7 @@
           <w:color w:val="007D38"/>
           <w:sz w:val="21"/>
         </w:rPr>
-        <w:t xml:space="preserve">Q16. </w:t>
+        <w:t xml:space="preserve">Q107. </w:t>
       </w:r>
       <w:r>
         <w:rPr>
@@ -5823,7 +5823,7 @@
           <w:color w:val="007D38"/>
           <w:sz w:val="21"/>
         </w:rPr>
-        <w:t xml:space="preserve">A16. </w:t>
+        <w:t xml:space="preserve">A107. </w:t>
       </w:r>
       <w:r>
         <w:rPr>
@@ -5843,7 +5843,7 @@
           <w:color w:val="007D38"/>
           <w:sz w:val="21"/>
         </w:rPr>
-        <w:t xml:space="preserve">Q17. </w:t>
+        <w:t xml:space="preserve">Q108. </w:t>
       </w:r>
       <w:r>
         <w:rPr>
@@ -5864,7 +5864,7 @@
           <w:color w:val="007D38"/>
           <w:sz w:val="21"/>
         </w:rPr>
-        <w:t xml:space="preserve">A17. </w:t>
+        <w:t xml:space="preserve">A108. </w:t>
       </w:r>
       <w:r>
         <w:rPr>
@@ -5926,7 +5926,7 @@
           <w:color w:val="007D38"/>
           <w:sz w:val="21"/>
         </w:rPr>
-        <w:t xml:space="preserve">Q18. </w:t>
+        <w:t xml:space="preserve">Q109. </w:t>
       </w:r>
       <w:r>
         <w:rPr>
@@ -5947,7 +5947,7 @@
           <w:color w:val="007D38"/>
           <w:sz w:val="21"/>
         </w:rPr>
-        <w:t xml:space="preserve">A18. </w:t>
+        <w:t xml:space="preserve">A109. </w:t>
       </w:r>
       <w:r>
         <w:rPr>
@@ -5967,7 +5967,7 @@
           <w:color w:val="007D38"/>
           <w:sz w:val="21"/>
         </w:rPr>
-        <w:t xml:space="preserve">Q19. </w:t>
+        <w:t xml:space="preserve">Q110. </w:t>
       </w:r>
       <w:r>
         <w:rPr>
@@ -5988,7 +5988,7 @@
           <w:color w:val="007D38"/>
           <w:sz w:val="21"/>
         </w:rPr>
-        <w:t xml:space="preserve">A19. </w:t>
+        <w:t xml:space="preserve">A110. </w:t>
       </w:r>
       <w:r>
         <w:rPr>
@@ -6106,7 +6106,7 @@
           <w:color w:val="007D38"/>
           <w:sz w:val="21"/>
         </w:rPr>
-        <w:t xml:space="preserve">Q20. </w:t>
+        <w:t xml:space="preserve">Q111. </w:t>
       </w:r>
       <w:r>
         <w:rPr>
@@ -6127,7 +6127,7 @@
           <w:color w:val="007D38"/>
           <w:sz w:val="21"/>
         </w:rPr>
-        <w:t xml:space="preserve">A20. </w:t>
+        <w:t xml:space="preserve">A111. </w:t>
       </w:r>
       <w:r>
         <w:rPr>
@@ -6147,7 +6147,7 @@
           <w:color w:val="007D38"/>
           <w:sz w:val="21"/>
         </w:rPr>
-        <w:t xml:space="preserve">Q21. </w:t>
+        <w:t xml:space="preserve">Q112. </w:t>
       </w:r>
       <w:r>
         <w:rPr>
@@ -6168,7 +6168,7 @@
           <w:color w:val="007D38"/>
           <w:sz w:val="21"/>
         </w:rPr>
-        <w:t xml:space="preserve">A21. </w:t>
+        <w:t xml:space="preserve">A112. </w:t>
       </w:r>
       <w:r>
         <w:rPr>
@@ -6351,7 +6351,7 @@
           <w:color w:val="007D38"/>
           <w:sz w:val="21"/>
         </w:rPr>
-        <w:t xml:space="preserve">Q1. </w:t>
+        <w:t xml:space="preserve">Q113. </w:t>
       </w:r>
       <w:r>
         <w:rPr>
@@ -6372,7 +6372,7 @@
           <w:color w:val="007D38"/>
           <w:sz w:val="21"/>
         </w:rPr>
-        <w:t xml:space="preserve">A1. </w:t>
+        <w:t xml:space="preserve">A113. </w:t>
       </w:r>
       <w:r>
         <w:rPr>
@@ -6434,7 +6434,7 @@
           <w:color w:val="007D38"/>
           <w:sz w:val="21"/>
         </w:rPr>
-        <w:t xml:space="preserve">Q2. </w:t>
+        <w:t xml:space="preserve">Q114. </w:t>
       </w:r>
       <w:r>
         <w:rPr>
@@ -6455,7 +6455,7 @@
           <w:color w:val="007D38"/>
           <w:sz w:val="21"/>
         </w:rPr>
-        <w:t xml:space="preserve">A2. </w:t>
+        <w:t xml:space="preserve">A114. </w:t>
       </w:r>
       <w:r>
         <w:rPr>
@@ -6475,7 +6475,7 @@
           <w:color w:val="007D38"/>
           <w:sz w:val="21"/>
         </w:rPr>
-        <w:t xml:space="preserve">Q3. </w:t>
+        <w:t xml:space="preserve">Q115. </w:t>
       </w:r>
       <w:r>
         <w:rPr>
@@ -6496,7 +6496,7 @@
           <w:color w:val="007D38"/>
           <w:sz w:val="21"/>
         </w:rPr>
-        <w:t xml:space="preserve">A3. </w:t>
+        <w:t xml:space="preserve">A115. </w:t>
       </w:r>
       <w:r>
         <w:rPr>
@@ -6516,7 +6516,7 @@
           <w:color w:val="007D38"/>
           <w:sz w:val="21"/>
         </w:rPr>
-        <w:t xml:space="preserve">Q4. </w:t>
+        <w:t xml:space="preserve">Q116. </w:t>
       </w:r>
       <w:r>
         <w:rPr>
@@ -6537,7 +6537,7 @@
           <w:color w:val="007D38"/>
           <w:sz w:val="21"/>
         </w:rPr>
-        <w:t xml:space="preserve">A4. </w:t>
+        <w:t xml:space="preserve">A116. </w:t>
       </w:r>
       <w:r>
         <w:rPr>
@@ -6557,7 +6557,7 @@
           <w:color w:val="007D38"/>
           <w:sz w:val="21"/>
         </w:rPr>
-        <w:t xml:space="preserve">Q5. </w:t>
+        <w:t xml:space="preserve">Q117. </w:t>
       </w:r>
       <w:r>
         <w:rPr>
@@ -6578,7 +6578,7 @@
           <w:color w:val="007D38"/>
           <w:sz w:val="21"/>
         </w:rPr>
-        <w:t xml:space="preserve">A5. </w:t>
+        <w:t xml:space="preserve">A117. </w:t>
       </w:r>
       <w:r>
         <w:rPr>
@@ -6598,7 +6598,7 @@
           <w:color w:val="007D38"/>
           <w:sz w:val="21"/>
         </w:rPr>
-        <w:t xml:space="preserve">Q6. </w:t>
+        <w:t xml:space="preserve">Q118. </w:t>
       </w:r>
       <w:r>
         <w:rPr>
@@ -6619,7 +6619,7 @@
           <w:color w:val="007D38"/>
           <w:sz w:val="21"/>
         </w:rPr>
-        <w:t xml:space="preserve">A6. </w:t>
+        <w:t xml:space="preserve">A118. </w:t>
       </w:r>
       <w:r>
         <w:rPr>
@@ -6639,7 +6639,7 @@
           <w:color w:val="007D38"/>
           <w:sz w:val="21"/>
         </w:rPr>
-        <w:t xml:space="preserve">Q7. </w:t>
+        <w:t xml:space="preserve">Q119. </w:t>
       </w:r>
       <w:r>
         <w:rPr>
@@ -6660,7 +6660,7 @@
           <w:color w:val="007D38"/>
           <w:sz w:val="21"/>
         </w:rPr>
-        <w:t xml:space="preserve">A7. </w:t>
+        <w:t xml:space="preserve">A119. </w:t>
       </w:r>
       <w:r>
         <w:rPr>
@@ -6680,7 +6680,7 @@
           <w:color w:val="007D38"/>
           <w:sz w:val="21"/>
         </w:rPr>
-        <w:t xml:space="preserve">Q8. </w:t>
+        <w:t xml:space="preserve">Q120. </w:t>
       </w:r>
       <w:r>
         <w:rPr>
@@ -6701,7 +6701,7 @@
           <w:color w:val="007D38"/>
           <w:sz w:val="21"/>
         </w:rPr>
-        <w:t xml:space="preserve">A8. </w:t>
+        <w:t xml:space="preserve">A120. </w:t>
       </w:r>
       <w:r>
         <w:rPr>
@@ -6721,7 +6721,7 @@
           <w:color w:val="007D38"/>
           <w:sz w:val="21"/>
         </w:rPr>
-        <w:t xml:space="preserve">Q9. </w:t>
+        <w:t xml:space="preserve">Q121. </w:t>
       </w:r>
       <w:r>
         <w:rPr>
@@ -6742,7 +6742,7 @@
           <w:color w:val="007D38"/>
           <w:sz w:val="21"/>
         </w:rPr>
-        <w:t xml:space="preserve">A9. </w:t>
+        <w:t xml:space="preserve">A121. </w:t>
       </w:r>
       <w:r>
         <w:rPr>
@@ -6762,7 +6762,7 @@
           <w:color w:val="007D38"/>
           <w:sz w:val="21"/>
         </w:rPr>
-        <w:t xml:space="preserve">Q10. </w:t>
+        <w:t xml:space="preserve">Q122. </w:t>
       </w:r>
       <w:r>
         <w:rPr>
@@ -6783,7 +6783,7 @@
           <w:color w:val="007D38"/>
           <w:sz w:val="21"/>
         </w:rPr>
-        <w:t xml:space="preserve">A10. </w:t>
+        <w:t xml:space="preserve">A122. </w:t>
       </w:r>
       <w:r>
         <w:rPr>
@@ -6873,7 +6873,7 @@
           <w:color w:val="007D38"/>
           <w:sz w:val="21"/>
         </w:rPr>
-        <w:t xml:space="preserve">Q11. </w:t>
+        <w:t xml:space="preserve">Q123. </w:t>
       </w:r>
       <w:r>
         <w:rPr>
@@ -6894,7 +6894,7 @@
           <w:color w:val="007D38"/>
           <w:sz w:val="21"/>
         </w:rPr>
-        <w:t xml:space="preserve">A11. </w:t>
+        <w:t xml:space="preserve">A123. </w:t>
       </w:r>
       <w:r>
         <w:rPr>
@@ -6914,7 +6914,7 @@
           <w:color w:val="007D38"/>
           <w:sz w:val="21"/>
         </w:rPr>
-        <w:t xml:space="preserve">Q12. </w:t>
+        <w:t xml:space="preserve">Q124. </w:t>
       </w:r>
       <w:r>
         <w:rPr>
@@ -6935,7 +6935,7 @@
           <w:color w:val="007D38"/>
           <w:sz w:val="21"/>
         </w:rPr>
-        <w:t xml:space="preserve">A12. </w:t>
+        <w:t xml:space="preserve">A124. </w:t>
       </w:r>
       <w:r>
         <w:rPr>
@@ -6955,7 +6955,7 @@
           <w:color w:val="007D38"/>
           <w:sz w:val="21"/>
         </w:rPr>
-        <w:t xml:space="preserve">Q13. </w:t>
+        <w:t xml:space="preserve">Q125. </w:t>
       </w:r>
       <w:r>
         <w:rPr>
@@ -6976,7 +6976,7 @@
           <w:color w:val="007D38"/>
           <w:sz w:val="21"/>
         </w:rPr>
-        <w:t xml:space="preserve">A13. </w:t>
+        <w:t xml:space="preserve">A125. </w:t>
       </w:r>
       <w:r>
         <w:rPr>
@@ -6996,7 +6996,7 @@
           <w:color w:val="007D38"/>
           <w:sz w:val="21"/>
         </w:rPr>
-        <w:t xml:space="preserve">Q14. </w:t>
+        <w:t xml:space="preserve">Q126. </w:t>
       </w:r>
       <w:r>
         <w:rPr>
@@ -7017,7 +7017,7 @@
           <w:color w:val="007D38"/>
           <w:sz w:val="21"/>
         </w:rPr>
-        <w:t xml:space="preserve">A14. </w:t>
+        <w:t xml:space="preserve">A126. </w:t>
       </w:r>
       <w:r>
         <w:rPr>
@@ -7102,7 +7102,7 @@
           <w:color w:val="007D38"/>
           <w:sz w:val="21"/>
         </w:rPr>
-        <w:t xml:space="preserve">Q1. </w:t>
+        <w:t xml:space="preserve">Q127. </w:t>
       </w:r>
       <w:r>
         <w:rPr>
@@ -7123,7 +7123,7 @@
           <w:color w:val="007D38"/>
           <w:sz w:val="21"/>
         </w:rPr>
-        <w:t xml:space="preserve">A1. </w:t>
+        <w:t xml:space="preserve">A127. </w:t>
       </w:r>
       <w:r>
         <w:rPr>
@@ -7143,7 +7143,7 @@
           <w:color w:val="007D38"/>
           <w:sz w:val="21"/>
         </w:rPr>
-        <w:t xml:space="preserve">Q2. </w:t>
+        <w:t xml:space="preserve">Q128. </w:t>
       </w:r>
       <w:r>
         <w:rPr>
@@ -7164,7 +7164,7 @@
           <w:color w:val="007D38"/>
           <w:sz w:val="21"/>
         </w:rPr>
-        <w:t xml:space="preserve">A2. </w:t>
+        <w:t xml:space="preserve">A128. </w:t>
       </w:r>
       <w:r>
         <w:rPr>
@@ -7184,7 +7184,7 @@
           <w:color w:val="007D38"/>
           <w:sz w:val="21"/>
         </w:rPr>
-        <w:t xml:space="preserve">Q3. </w:t>
+        <w:t xml:space="preserve">Q129. </w:t>
       </w:r>
       <w:r>
         <w:rPr>
@@ -7205,7 +7205,7 @@
           <w:color w:val="007D38"/>
           <w:sz w:val="21"/>
         </w:rPr>
-        <w:t xml:space="preserve">A3. </w:t>
+        <w:t xml:space="preserve">A129. </w:t>
       </w:r>
       <w:r>
         <w:rPr>
@@ -7225,7 +7225,7 @@
           <w:color w:val="007D38"/>
           <w:sz w:val="21"/>
         </w:rPr>
-        <w:t xml:space="preserve">Q4. </w:t>
+        <w:t xml:space="preserve">Q130. </w:t>
       </w:r>
       <w:r>
         <w:rPr>
@@ -7246,7 +7246,7 @@
           <w:color w:val="007D38"/>
           <w:sz w:val="21"/>
         </w:rPr>
-        <w:t xml:space="preserve">A4. </w:t>
+        <w:t xml:space="preserve">A130. </w:t>
       </w:r>
       <w:r>
         <w:rPr>
@@ -7266,7 +7266,7 @@
           <w:color w:val="007D38"/>
           <w:sz w:val="21"/>
         </w:rPr>
-        <w:t xml:space="preserve">Q5. </w:t>
+        <w:t xml:space="preserve">Q131. </w:t>
       </w:r>
       <w:r>
         <w:rPr>
@@ -7287,7 +7287,7 @@
           <w:color w:val="007D38"/>
           <w:sz w:val="21"/>
         </w:rPr>
-        <w:t xml:space="preserve">A5. </w:t>
+        <w:t xml:space="preserve">A131. </w:t>
       </w:r>
       <w:r>
         <w:rPr>
@@ -7307,7 +7307,7 @@
           <w:color w:val="007D38"/>
           <w:sz w:val="21"/>
         </w:rPr>
-        <w:t xml:space="preserve">Q6. </w:t>
+        <w:t xml:space="preserve">Q132. </w:t>
       </w:r>
       <w:r>
         <w:rPr>
@@ -7328,7 +7328,7 @@
           <w:color w:val="007D38"/>
           <w:sz w:val="21"/>
         </w:rPr>
-        <w:t xml:space="preserve">A6. </w:t>
+        <w:t xml:space="preserve">A132. </w:t>
       </w:r>
       <w:r>
         <w:rPr>
@@ -7348,7 +7348,7 @@
           <w:color w:val="007D38"/>
           <w:sz w:val="21"/>
         </w:rPr>
-        <w:t xml:space="preserve">Q7. </w:t>
+        <w:t xml:space="preserve">Q133. </w:t>
       </w:r>
       <w:r>
         <w:rPr>
@@ -7369,7 +7369,7 @@
           <w:color w:val="007D38"/>
           <w:sz w:val="21"/>
         </w:rPr>
-        <w:t xml:space="preserve">A7. </w:t>
+        <w:t xml:space="preserve">A133. </w:t>
       </w:r>
       <w:r>
         <w:rPr>
@@ -7389,7 +7389,7 @@
           <w:color w:val="007D38"/>
           <w:sz w:val="21"/>
         </w:rPr>
-        <w:t xml:space="preserve">Q8. </w:t>
+        <w:t xml:space="preserve">Q134. </w:t>
       </w:r>
       <w:r>
         <w:rPr>
@@ -7410,7 +7410,7 @@
           <w:color w:val="007D38"/>
           <w:sz w:val="21"/>
         </w:rPr>
-        <w:t xml:space="preserve">A8. </w:t>
+        <w:t xml:space="preserve">A134. </w:t>
       </w:r>
       <w:r>
         <w:rPr>
@@ -7430,7 +7430,7 @@
           <w:color w:val="007D38"/>
           <w:sz w:val="21"/>
         </w:rPr>
-        <w:t xml:space="preserve">Q9. </w:t>
+        <w:t xml:space="preserve">Q135. </w:t>
       </w:r>
       <w:r>
         <w:rPr>
@@ -7451,7 +7451,7 @@
           <w:color w:val="007D38"/>
           <w:sz w:val="21"/>
         </w:rPr>
-        <w:t xml:space="preserve">A9. </w:t>
+        <w:t xml:space="preserve">A135. </w:t>
       </w:r>
       <w:r>
         <w:rPr>
@@ -7527,7 +7527,7 @@
           <w:color w:val="007D38"/>
           <w:sz w:val="21"/>
         </w:rPr>
-        <w:t xml:space="preserve">Q10. </w:t>
+        <w:t xml:space="preserve">Q136. </w:t>
       </w:r>
       <w:r>
         <w:rPr>
@@ -7548,7 +7548,7 @@
           <w:color w:val="007D38"/>
           <w:sz w:val="21"/>
         </w:rPr>
-        <w:t xml:space="preserve">A10. </w:t>
+        <w:t xml:space="preserve">A136. </w:t>
       </w:r>
       <w:r>
         <w:rPr>
@@ -7568,7 +7568,7 @@
           <w:color w:val="007D38"/>
           <w:sz w:val="21"/>
         </w:rPr>
-        <w:t xml:space="preserve">Q11. </w:t>
+        <w:t xml:space="preserve">Q137. </w:t>
       </w:r>
       <w:r>
         <w:rPr>
@@ -7589,7 +7589,7 @@
           <w:color w:val="007D38"/>
           <w:sz w:val="21"/>
         </w:rPr>
-        <w:t xml:space="preserve">A11. </w:t>
+        <w:t xml:space="preserve">A137. </w:t>
       </w:r>
       <w:r>
         <w:rPr>
@@ -7609,7 +7609,7 @@
           <w:color w:val="007D38"/>
           <w:sz w:val="21"/>
         </w:rPr>
-        <w:t xml:space="preserve">Q12. </w:t>
+        <w:t xml:space="preserve">Q138. </w:t>
       </w:r>
       <w:r>
         <w:rPr>
@@ -7630,7 +7630,7 @@
           <w:color w:val="007D38"/>
           <w:sz w:val="21"/>
         </w:rPr>
-        <w:t xml:space="preserve">A12. </w:t>
+        <w:t xml:space="preserve">A138. </w:t>
       </w:r>
       <w:r>
         <w:rPr>
@@ -7715,7 +7715,7 @@
           <w:color w:val="007D38"/>
           <w:sz w:val="21"/>
         </w:rPr>
-        <w:t xml:space="preserve">Q1. </w:t>
+        <w:t xml:space="preserve">Q139. </w:t>
       </w:r>
       <w:r>
         <w:rPr>
@@ -7736,7 +7736,7 @@
           <w:color w:val="007D38"/>
           <w:sz w:val="21"/>
         </w:rPr>
-        <w:t xml:space="preserve">A1. </w:t>
+        <w:t xml:space="preserve">A139. </w:t>
       </w:r>
       <w:r>
         <w:rPr>
@@ -7756,7 +7756,7 @@
           <w:color w:val="007D38"/>
           <w:sz w:val="21"/>
         </w:rPr>
-        <w:t xml:space="preserve">Q2. </w:t>
+        <w:t xml:space="preserve">Q140. </w:t>
       </w:r>
       <w:r>
         <w:rPr>
@@ -7777,7 +7777,7 @@
           <w:color w:val="007D38"/>
           <w:sz w:val="21"/>
         </w:rPr>
-        <w:t xml:space="preserve">A2. </w:t>
+        <w:t xml:space="preserve">A140. </w:t>
       </w:r>
       <w:r>
         <w:rPr>
@@ -7797,7 +7797,7 @@
           <w:color w:val="007D38"/>
           <w:sz w:val="21"/>
         </w:rPr>
-        <w:t xml:space="preserve">Q3. </w:t>
+        <w:t xml:space="preserve">Q141. </w:t>
       </w:r>
       <w:r>
         <w:rPr>
@@ -7818,7 +7818,7 @@
           <w:color w:val="007D38"/>
           <w:sz w:val="21"/>
         </w:rPr>
-        <w:t xml:space="preserve">A3. </w:t>
+        <w:t xml:space="preserve">A141. </w:t>
       </w:r>
       <w:r>
         <w:rPr>
@@ -7838,7 +7838,7 @@
           <w:color w:val="007D38"/>
           <w:sz w:val="21"/>
         </w:rPr>
-        <w:t xml:space="preserve">Q4. </w:t>
+        <w:t xml:space="preserve">Q142. </w:t>
       </w:r>
       <w:r>
         <w:rPr>
@@ -7859,7 +7859,7 @@
           <w:color w:val="007D38"/>
           <w:sz w:val="21"/>
         </w:rPr>
-        <w:t xml:space="preserve">A4. </w:t>
+        <w:t xml:space="preserve">A142. </w:t>
       </w:r>
       <w:r>
         <w:rPr>
@@ -7879,7 +7879,7 @@
           <w:color w:val="007D38"/>
           <w:sz w:val="21"/>
         </w:rPr>
-        <w:t xml:space="preserve">Q5. </w:t>
+        <w:t xml:space="preserve">Q143. </w:t>
       </w:r>
       <w:r>
         <w:rPr>
@@ -7900,7 +7900,7 @@
           <w:color w:val="007D38"/>
           <w:sz w:val="21"/>
         </w:rPr>
-        <w:t xml:space="preserve">A5. </w:t>
+        <w:t xml:space="preserve">A143. </w:t>
       </w:r>
       <w:r>
         <w:rPr>
@@ -8018,7 +8018,7 @@
           <w:color w:val="007D38"/>
           <w:sz w:val="21"/>
         </w:rPr>
-        <w:t xml:space="preserve">Q6. </w:t>
+        <w:t xml:space="preserve">Q144. </w:t>
       </w:r>
       <w:r>
         <w:rPr>
@@ -8039,7 +8039,7 @@
           <w:color w:val="007D38"/>
           <w:sz w:val="21"/>
         </w:rPr>
-        <w:t xml:space="preserve">A6. </w:t>
+        <w:t xml:space="preserve">A144. </w:t>
       </w:r>
       <w:r>
         <w:rPr>
@@ -8059,7 +8059,7 @@
           <w:color w:val="007D38"/>
           <w:sz w:val="21"/>
         </w:rPr>
-        <w:t xml:space="preserve">Q7. </w:t>
+        <w:t xml:space="preserve">Q145. </w:t>
       </w:r>
       <w:r>
         <w:rPr>
@@ -8080,7 +8080,7 @@
           <w:color w:val="007D38"/>
           <w:sz w:val="21"/>
         </w:rPr>
-        <w:t xml:space="preserve">A7. </w:t>
+        <w:t xml:space="preserve">A145. </w:t>
       </w:r>
       <w:r>
         <w:rPr>
@@ -8100,7 +8100,7 @@
           <w:color w:val="007D38"/>
           <w:sz w:val="21"/>
         </w:rPr>
-        <w:t xml:space="preserve">Q8. </w:t>
+        <w:t xml:space="preserve">Q146. </w:t>
       </w:r>
       <w:r>
         <w:rPr>
@@ -8121,7 +8121,7 @@
           <w:color w:val="007D38"/>
           <w:sz w:val="21"/>
         </w:rPr>
-        <w:t xml:space="preserve">A8. </w:t>
+        <w:t xml:space="preserve">A146. </w:t>
       </w:r>
       <w:r>
         <w:rPr>
@@ -8141,7 +8141,7 @@
           <w:color w:val="007D38"/>
           <w:sz w:val="21"/>
         </w:rPr>
-        <w:t xml:space="preserve">Q9. </w:t>
+        <w:t xml:space="preserve">Q147. </w:t>
       </w:r>
       <w:r>
         <w:rPr>
@@ -8162,7 +8162,7 @@
           <w:color w:val="007D38"/>
           <w:sz w:val="21"/>
         </w:rPr>
-        <w:t xml:space="preserve">A9. </w:t>
+        <w:t xml:space="preserve">A147. </w:t>
       </w:r>
       <w:r>
         <w:rPr>
@@ -8182,7 +8182,7 @@
           <w:color w:val="007D38"/>
           <w:sz w:val="21"/>
         </w:rPr>
-        <w:t xml:space="preserve">Q10. </w:t>
+        <w:t xml:space="preserve">Q148. </w:t>
       </w:r>
       <w:r>
         <w:rPr>
@@ -8203,7 +8203,7 @@
           <w:color w:val="007D38"/>
           <w:sz w:val="21"/>
         </w:rPr>
-        <w:t xml:space="preserve">A10. </w:t>
+        <w:t xml:space="preserve">A148. </w:t>
       </w:r>
       <w:r>
         <w:rPr>
@@ -8223,7 +8223,7 @@
           <w:color w:val="007D38"/>
           <w:sz w:val="21"/>
         </w:rPr>
-        <w:t xml:space="preserve">Q11. </w:t>
+        <w:t xml:space="preserve">Q149. </w:t>
       </w:r>
       <w:r>
         <w:rPr>
@@ -8244,7 +8244,7 @@
           <w:color w:val="007D38"/>
           <w:sz w:val="21"/>
         </w:rPr>
-        <w:t xml:space="preserve">A11. </w:t>
+        <w:t xml:space="preserve">A149. </w:t>
       </w:r>
       <w:r>
         <w:rPr>
@@ -8264,7 +8264,7 @@
           <w:color w:val="007D38"/>
           <w:sz w:val="21"/>
         </w:rPr>
-        <w:t xml:space="preserve">Q12. </w:t>
+        <w:t xml:space="preserve">Q150. </w:t>
       </w:r>
       <w:r>
         <w:rPr>
@@ -8285,7 +8285,7 @@
           <w:color w:val="007D38"/>
           <w:sz w:val="21"/>
         </w:rPr>
-        <w:t xml:space="preserve">A12. </w:t>
+        <w:t xml:space="preserve">A150. </w:t>
       </w:r>
       <w:r>
         <w:rPr>
@@ -8305,7 +8305,7 @@
           <w:color w:val="007D38"/>
           <w:sz w:val="21"/>
         </w:rPr>
-        <w:t xml:space="preserve">Q13. </w:t>
+        <w:t xml:space="preserve">Q151. </w:t>
       </w:r>
       <w:r>
         <w:rPr>
@@ -8326,7 +8326,7 @@
           <w:color w:val="007D38"/>
           <w:sz w:val="21"/>
         </w:rPr>
-        <w:t xml:space="preserve">A13. </w:t>
+        <w:t xml:space="preserve">A151. </w:t>
       </w:r>
       <w:r>
         <w:rPr>
@@ -8430,7 +8430,7 @@
           <w:color w:val="007D38"/>
           <w:sz w:val="21"/>
         </w:rPr>
-        <w:t xml:space="preserve">Q14. </w:t>
+        <w:t xml:space="preserve">Q152. </w:t>
       </w:r>
       <w:r>
         <w:rPr>
@@ -8451,7 +8451,7 @@
           <w:color w:val="007D38"/>
           <w:sz w:val="21"/>
         </w:rPr>
-        <w:t xml:space="preserve">A14. </w:t>
+        <w:t xml:space="preserve">A152. </w:t>
       </w:r>
       <w:r>
         <w:rPr>
@@ -8536,7 +8536,7 @@
           <w:color w:val="007D38"/>
           <w:sz w:val="21"/>
         </w:rPr>
-        <w:t xml:space="preserve">Q1. </w:t>
+        <w:t xml:space="preserve">Q153. </w:t>
       </w:r>
       <w:r>
         <w:rPr>
@@ -8557,7 +8557,7 @@
           <w:color w:val="007D38"/>
           <w:sz w:val="21"/>
         </w:rPr>
-        <w:t xml:space="preserve">A1. </w:t>
+        <w:t xml:space="preserve">A153. </w:t>
       </w:r>
       <w:r>
         <w:rPr>
@@ -8577,7 +8577,7 @@
           <w:color w:val="007D38"/>
           <w:sz w:val="21"/>
         </w:rPr>
-        <w:t xml:space="preserve">Q2. </w:t>
+        <w:t xml:space="preserve">Q154. </w:t>
       </w:r>
       <w:r>
         <w:rPr>
@@ -8598,7 +8598,7 @@
           <w:color w:val="007D38"/>
           <w:sz w:val="21"/>
         </w:rPr>
-        <w:t xml:space="preserve">A2. </w:t>
+        <w:t xml:space="preserve">A154. </w:t>
       </w:r>
       <w:r>
         <w:rPr>
@@ -8618,7 +8618,7 @@
           <w:color w:val="007D38"/>
           <w:sz w:val="21"/>
         </w:rPr>
-        <w:t xml:space="preserve">Q3. </w:t>
+        <w:t xml:space="preserve">Q155. </w:t>
       </w:r>
       <w:r>
         <w:rPr>
@@ -8639,7 +8639,7 @@
           <w:color w:val="007D38"/>
           <w:sz w:val="21"/>
         </w:rPr>
-        <w:t xml:space="preserve">A3. </w:t>
+        <w:t xml:space="preserve">A155. </w:t>
       </w:r>
       <w:r>
         <w:rPr>
@@ -8659,7 +8659,7 @@
           <w:color w:val="007D38"/>
           <w:sz w:val="21"/>
         </w:rPr>
-        <w:t xml:space="preserve">Q4. </w:t>
+        <w:t xml:space="preserve">Q156. </w:t>
       </w:r>
       <w:r>
         <w:rPr>
@@ -8680,7 +8680,7 @@
           <w:color w:val="007D38"/>
           <w:sz w:val="21"/>
         </w:rPr>
-        <w:t xml:space="preserve">A4. </w:t>
+        <w:t xml:space="preserve">A156. </w:t>
       </w:r>
       <w:r>
         <w:rPr>
@@ -8700,7 +8700,7 @@
           <w:color w:val="007D38"/>
           <w:sz w:val="21"/>
         </w:rPr>
-        <w:t xml:space="preserve">Q5. </w:t>
+        <w:t xml:space="preserve">Q157. </w:t>
       </w:r>
       <w:r>
         <w:rPr>
@@ -8721,7 +8721,7 @@
           <w:color w:val="007D38"/>
           <w:sz w:val="21"/>
         </w:rPr>
-        <w:t xml:space="preserve">A5. </w:t>
+        <w:t xml:space="preserve">A157. </w:t>
       </w:r>
       <w:r>
         <w:rPr>
@@ -8741,7 +8741,7 @@
           <w:color w:val="007D38"/>
           <w:sz w:val="21"/>
         </w:rPr>
-        <w:t xml:space="preserve">Q6. </w:t>
+        <w:t xml:space="preserve">Q158. </w:t>
       </w:r>
       <w:r>
         <w:rPr>
@@ -8762,7 +8762,7 @@
           <w:color w:val="007D38"/>
           <w:sz w:val="21"/>
         </w:rPr>
-        <w:t xml:space="preserve">A6. </w:t>
+        <w:t xml:space="preserve">A158. </w:t>
       </w:r>
       <w:r>
         <w:rPr>
@@ -8847,7 +8847,7 @@
           <w:color w:val="007D38"/>
           <w:sz w:val="21"/>
         </w:rPr>
-        <w:t xml:space="preserve">Q1. </w:t>
+        <w:t xml:space="preserve">Q159. </w:t>
       </w:r>
       <w:r>
         <w:rPr>
@@ -8868,7 +8868,7 @@
           <w:color w:val="007D38"/>
           <w:sz w:val="21"/>
         </w:rPr>
-        <w:t xml:space="preserve">A1. </w:t>
+        <w:t xml:space="preserve">A159. </w:t>
       </w:r>
       <w:r>
         <w:rPr>
@@ -8944,7 +8944,7 @@
           <w:color w:val="007D38"/>
           <w:sz w:val="21"/>
         </w:rPr>
-        <w:t xml:space="preserve">Q2. </w:t>
+        <w:t xml:space="preserve">Q160. </w:t>
       </w:r>
       <w:r>
         <w:rPr>
@@ -8965,7 +8965,7 @@
           <w:color w:val="007D38"/>
           <w:sz w:val="21"/>
         </w:rPr>
-        <w:t xml:space="preserve">A2. </w:t>
+        <w:t xml:space="preserve">A160. </w:t>
       </w:r>
       <w:r>
         <w:rPr>
@@ -8985,7 +8985,7 @@
           <w:color w:val="007D38"/>
           <w:sz w:val="21"/>
         </w:rPr>
-        <w:t xml:space="preserve">Q3. </w:t>
+        <w:t xml:space="preserve">Q161. </w:t>
       </w:r>
       <w:r>
         <w:rPr>
@@ -9006,7 +9006,7 @@
           <w:color w:val="007D38"/>
           <w:sz w:val="21"/>
         </w:rPr>
-        <w:t xml:space="preserve">A3. </w:t>
+        <w:t xml:space="preserve">A161. </w:t>
       </w:r>
       <w:r>
         <w:rPr>
@@ -9026,7 +9026,7 @@
           <w:color w:val="007D38"/>
           <w:sz w:val="21"/>
         </w:rPr>
-        <w:t xml:space="preserve">Q4. </w:t>
+        <w:t xml:space="preserve">Q162. </w:t>
       </w:r>
       <w:r>
         <w:rPr>
@@ -9047,7 +9047,7 @@
           <w:color w:val="007D38"/>
           <w:sz w:val="21"/>
         </w:rPr>
-        <w:t xml:space="preserve">A4. </w:t>
+        <w:t xml:space="preserve">A162. </w:t>
       </w:r>
       <w:r>
         <w:rPr>
@@ -9067,7 +9067,7 @@
           <w:color w:val="007D38"/>
           <w:sz w:val="21"/>
         </w:rPr>
-        <w:t xml:space="preserve">Q5. </w:t>
+        <w:t xml:space="preserve">Q163. </w:t>
       </w:r>
       <w:r>
         <w:rPr>
@@ -9088,7 +9088,7 @@
           <w:color w:val="007D38"/>
           <w:sz w:val="21"/>
         </w:rPr>
-        <w:t xml:space="preserve">A5. </w:t>
+        <w:t xml:space="preserve">A163. </w:t>
       </w:r>
       <w:r>
         <w:rPr>
@@ -9150,7 +9150,7 @@
           <w:color w:val="007D38"/>
           <w:sz w:val="21"/>
         </w:rPr>
-        <w:t xml:space="preserve">Q6. </w:t>
+        <w:t xml:space="preserve">Q164. </w:t>
       </w:r>
       <w:r>
         <w:rPr>
@@ -9171,7 +9171,7 @@
           <w:color w:val="007D38"/>
           <w:sz w:val="21"/>
         </w:rPr>
-        <w:t xml:space="preserve">A6. </w:t>
+        <w:t xml:space="preserve">A164. </w:t>
       </w:r>
       <w:r>
         <w:rPr>
@@ -9191,7 +9191,7 @@
           <w:color w:val="007D38"/>
           <w:sz w:val="21"/>
         </w:rPr>
-        <w:t xml:space="preserve">Q7. </w:t>
+        <w:t xml:space="preserve">Q165. </w:t>
       </w:r>
       <w:r>
         <w:rPr>
@@ -9212,7 +9212,7 @@
           <w:color w:val="007D38"/>
           <w:sz w:val="21"/>
         </w:rPr>
-        <w:t xml:space="preserve">A7. </w:t>
+        <w:t xml:space="preserve">A165. </w:t>
       </w:r>
       <w:r>
         <w:rPr>
@@ -9297,7 +9297,7 @@
           <w:color w:val="007D38"/>
           <w:sz w:val="21"/>
         </w:rPr>
-        <w:t xml:space="preserve">Q1. </w:t>
+        <w:t xml:space="preserve">Q166. </w:t>
       </w:r>
       <w:r>
         <w:rPr>
@@ -9318,7 +9318,7 @@
           <w:color w:val="007D38"/>
           <w:sz w:val="21"/>
         </w:rPr>
-        <w:t xml:space="preserve">A1. </w:t>
+        <w:t xml:space="preserve">A166. </w:t>
       </w:r>
       <w:r>
         <w:rPr>
@@ -9338,7 +9338,7 @@
           <w:color w:val="007D38"/>
           <w:sz w:val="21"/>
         </w:rPr>
-        <w:t xml:space="preserve">Q2. </w:t>
+        <w:t xml:space="preserve">Q167. </w:t>
       </w:r>
       <w:r>
         <w:rPr>
@@ -9359,7 +9359,7 @@
           <w:color w:val="007D38"/>
           <w:sz w:val="21"/>
         </w:rPr>
-        <w:t xml:space="preserve">A2. </w:t>
+        <w:t xml:space="preserve">A167. </w:t>
       </w:r>
       <w:r>
         <w:rPr>
@@ -9379,7 +9379,7 @@
           <w:color w:val="007D38"/>
           <w:sz w:val="21"/>
         </w:rPr>
-        <w:t xml:space="preserve">Q3. </w:t>
+        <w:t xml:space="preserve">Q168. </w:t>
       </w:r>
       <w:r>
         <w:rPr>
@@ -9400,7 +9400,7 @@
           <w:color w:val="007D38"/>
           <w:sz w:val="21"/>
         </w:rPr>
-        <w:t xml:space="preserve">A3. </w:t>
+        <w:t xml:space="preserve">A168. </w:t>
       </w:r>
       <w:r>
         <w:rPr>
@@ -9476,7 +9476,7 @@
           <w:color w:val="007D38"/>
           <w:sz w:val="21"/>
         </w:rPr>
-        <w:t xml:space="preserve">Q4. </w:t>
+        <w:t xml:space="preserve">Q169. </w:t>
       </w:r>
       <w:r>
         <w:rPr>
@@ -9497,7 +9497,7 @@
           <w:color w:val="007D38"/>
           <w:sz w:val="21"/>
         </w:rPr>
-        <w:t xml:space="preserve">A4. </w:t>
+        <w:t xml:space="preserve">A169. </w:t>
       </w:r>
       <w:r>
         <w:rPr>
@@ -9517,7 +9517,7 @@
           <w:color w:val="007D38"/>
           <w:sz w:val="21"/>
         </w:rPr>
-        <w:t xml:space="preserve">Q5. </w:t>
+        <w:t xml:space="preserve">Q170. </w:t>
       </w:r>
       <w:r>
         <w:rPr>
@@ -9538,7 +9538,7 @@
           <w:color w:val="007D38"/>
           <w:sz w:val="21"/>
         </w:rPr>
-        <w:t xml:space="preserve">A5. </w:t>
+        <w:t xml:space="preserve">A170. </w:t>
       </w:r>
       <w:r>
         <w:rPr>
@@ -9558,7 +9558,7 @@
           <w:color w:val="007D38"/>
           <w:sz w:val="21"/>
         </w:rPr>
-        <w:t xml:space="preserve">Q6. </w:t>
+        <w:t xml:space="preserve">Q171. </w:t>
       </w:r>
       <w:r>
         <w:rPr>
@@ -9579,7 +9579,7 @@
           <w:color w:val="007D38"/>
           <w:sz w:val="21"/>
         </w:rPr>
-        <w:t xml:space="preserve">A6. </w:t>
+        <w:t xml:space="preserve">A171. </w:t>
       </w:r>
       <w:r>
         <w:rPr>
@@ -9599,7 +9599,7 @@
           <w:color w:val="007D38"/>
           <w:sz w:val="21"/>
         </w:rPr>
-        <w:t xml:space="preserve">Q7. </w:t>
+        <w:t xml:space="preserve">Q172. </w:t>
       </w:r>
       <w:r>
         <w:rPr>
@@ -9620,7 +9620,7 @@
           <w:color w:val="007D38"/>
           <w:sz w:val="21"/>
         </w:rPr>
-        <w:t xml:space="preserve">A7. </w:t>
+        <w:t xml:space="preserve">A172. </w:t>
       </w:r>
       <w:r>
         <w:rPr>
@@ -9640,7 +9640,7 @@
           <w:color w:val="007D38"/>
           <w:sz w:val="21"/>
         </w:rPr>
-        <w:t xml:space="preserve">Q8. </w:t>
+        <w:t xml:space="preserve">Q173. </w:t>
       </w:r>
       <w:r>
         <w:rPr>
@@ -9661,7 +9661,7 @@
           <w:color w:val="007D38"/>
           <w:sz w:val="21"/>
         </w:rPr>
-        <w:t xml:space="preserve">A8. </w:t>
+        <w:t xml:space="preserve">A173. </w:t>
       </w:r>
       <w:r>
         <w:rPr>
@@ -9681,7 +9681,7 @@
           <w:color w:val="007D38"/>
           <w:sz w:val="21"/>
         </w:rPr>
-        <w:t xml:space="preserve">Q9. </w:t>
+        <w:t xml:space="preserve">Q174. </w:t>
       </w:r>
       <w:r>
         <w:rPr>
@@ -9702,7 +9702,7 @@
           <w:color w:val="007D38"/>
           <w:sz w:val="21"/>
         </w:rPr>
-        <w:t xml:space="preserve">A9. </w:t>
+        <w:t xml:space="preserve">A174. </w:t>
       </w:r>
       <w:r>
         <w:rPr>
@@ -9722,7 +9722,7 @@
           <w:color w:val="007D38"/>
           <w:sz w:val="21"/>
         </w:rPr>
-        <w:t xml:space="preserve">Q10. </w:t>
+        <w:t xml:space="preserve">Q175. </w:t>
       </w:r>
       <w:r>
         <w:rPr>
@@ -9743,7 +9743,7 @@
           <w:color w:val="007D38"/>
           <w:sz w:val="21"/>
         </w:rPr>
-        <w:t xml:space="preserve">A10. </w:t>
+        <w:t xml:space="preserve">A175. </w:t>
       </w:r>
       <w:r>
         <w:rPr>
@@ -9763,7 +9763,7 @@
           <w:color w:val="007D38"/>
           <w:sz w:val="21"/>
         </w:rPr>
-        <w:t xml:space="preserve">Q11. </w:t>
+        <w:t xml:space="preserve">Q176. </w:t>
       </w:r>
       <w:r>
         <w:rPr>
@@ -9784,7 +9784,7 @@
           <w:color w:val="007D38"/>
           <w:sz w:val="21"/>
         </w:rPr>
-        <w:t xml:space="preserve">A11. </w:t>
+        <w:t xml:space="preserve">A176. </w:t>
       </w:r>
       <w:r>
         <w:rPr>
@@ -9804,7 +9804,7 @@
           <w:color w:val="007D38"/>
           <w:sz w:val="21"/>
         </w:rPr>
-        <w:t xml:space="preserve">Q12. </w:t>
+        <w:t xml:space="preserve">Q177. </w:t>
       </w:r>
       <w:r>
         <w:rPr>
@@ -9825,7 +9825,7 @@
           <w:color w:val="007D38"/>
           <w:sz w:val="21"/>
         </w:rPr>
-        <w:t xml:space="preserve">A12. </w:t>
+        <w:t xml:space="preserve">A177. </w:t>
       </w:r>
       <w:r>
         <w:rPr>
@@ -9845,7 +9845,7 @@
           <w:color w:val="007D38"/>
           <w:sz w:val="21"/>
         </w:rPr>
-        <w:t xml:space="preserve">Q13. </w:t>
+        <w:t xml:space="preserve">Q178. </w:t>
       </w:r>
       <w:r>
         <w:rPr>
@@ -9866,7 +9866,7 @@
           <w:color w:val="007D38"/>
           <w:sz w:val="21"/>
         </w:rPr>
-        <w:t xml:space="preserve">A13. </w:t>
+        <w:t xml:space="preserve">A178. </w:t>
       </w:r>
       <w:r>
         <w:rPr>
@@ -9886,7 +9886,7 @@
           <w:color w:val="007D38"/>
           <w:sz w:val="21"/>
         </w:rPr>
-        <w:t xml:space="preserve">Q14. </w:t>
+        <w:t xml:space="preserve">Q179. </w:t>
       </w:r>
       <w:r>
         <w:rPr>
@@ -9907,7 +9907,7 @@
           <w:color w:val="007D38"/>
           <w:sz w:val="21"/>
         </w:rPr>
-        <w:t xml:space="preserve">A14. </w:t>
+        <w:t xml:space="preserve">A179. </w:t>
       </w:r>
       <w:r>
         <w:rPr>
@@ -9992,7 +9992,7 @@
           <w:color w:val="007D38"/>
           <w:sz w:val="21"/>
         </w:rPr>
-        <w:t xml:space="preserve">Q1. </w:t>
+        <w:t xml:space="preserve">Q180. </w:t>
       </w:r>
       <w:r>
         <w:rPr>
@@ -10013,7 +10013,7 @@
           <w:color w:val="007D38"/>
           <w:sz w:val="21"/>
         </w:rPr>
-        <w:t xml:space="preserve">A1. </w:t>
+        <w:t xml:space="preserve">A180. </w:t>
       </w:r>
       <w:r>
         <w:rPr>
@@ -10033,7 +10033,7 @@
           <w:color w:val="007D38"/>
           <w:sz w:val="21"/>
         </w:rPr>
-        <w:t xml:space="preserve">Q2. </w:t>
+        <w:t xml:space="preserve">Q181. </w:t>
       </w:r>
       <w:r>
         <w:rPr>
@@ -10054,7 +10054,7 @@
           <w:color w:val="007D38"/>
           <w:sz w:val="21"/>
         </w:rPr>
-        <w:t xml:space="preserve">A2. </w:t>
+        <w:t xml:space="preserve">A181. </w:t>
       </w:r>
       <w:r>
         <w:rPr>
@@ -10074,7 +10074,7 @@
           <w:color w:val="007D38"/>
           <w:sz w:val="21"/>
         </w:rPr>
-        <w:t xml:space="preserve">Q3. </w:t>
+        <w:t xml:space="preserve">Q182. </w:t>
       </w:r>
       <w:r>
         <w:rPr>
@@ -10095,7 +10095,7 @@
           <w:color w:val="007D38"/>
           <w:sz w:val="21"/>
         </w:rPr>
-        <w:t xml:space="preserve">A3. </w:t>
+        <w:t xml:space="preserve">A182. </w:t>
       </w:r>
       <w:r>
         <w:rPr>
@@ -10115,7 +10115,7 @@
           <w:color w:val="007D38"/>
           <w:sz w:val="21"/>
         </w:rPr>
-        <w:t xml:space="preserve">Q4. </w:t>
+        <w:t xml:space="preserve">Q183. </w:t>
       </w:r>
       <w:r>
         <w:rPr>
@@ -10136,7 +10136,7 @@
           <w:color w:val="007D38"/>
           <w:sz w:val="21"/>
         </w:rPr>
-        <w:t xml:space="preserve">A4. </w:t>
+        <w:t xml:space="preserve">A183. </w:t>
       </w:r>
       <w:r>
         <w:rPr>
@@ -10156,7 +10156,7 @@
           <w:color w:val="007D38"/>
           <w:sz w:val="21"/>
         </w:rPr>
-        <w:t xml:space="preserve">Q5. </w:t>
+        <w:t xml:space="preserve">Q184. </w:t>
       </w:r>
       <w:r>
         <w:rPr>
@@ -10177,7 +10177,7 @@
           <w:color w:val="007D38"/>
           <w:sz w:val="21"/>
         </w:rPr>
-        <w:t xml:space="preserve">A5. </w:t>
+        <w:t xml:space="preserve">A184. </w:t>
       </w:r>
       <w:r>
         <w:rPr>
@@ -10197,7 +10197,7 @@
           <w:color w:val="007D38"/>
           <w:sz w:val="21"/>
         </w:rPr>
-        <w:t xml:space="preserve">Q6. </w:t>
+        <w:t xml:space="preserve">Q185. </w:t>
       </w:r>
       <w:r>
         <w:rPr>
@@ -10218,7 +10218,7 @@
           <w:color w:val="007D38"/>
           <w:sz w:val="21"/>
         </w:rPr>
-        <w:t xml:space="preserve">A6. </w:t>
+        <w:t xml:space="preserve">A185. </w:t>
       </w:r>
       <w:r>
         <w:rPr>
@@ -10238,7 +10238,7 @@
           <w:color w:val="007D38"/>
           <w:sz w:val="21"/>
         </w:rPr>
-        <w:t xml:space="preserve">Q7. </w:t>
+        <w:t xml:space="preserve">Q186. </w:t>
       </w:r>
       <w:r>
         <w:rPr>
@@ -10259,7 +10259,7 @@
           <w:color w:val="007D38"/>
           <w:sz w:val="21"/>
         </w:rPr>
-        <w:t xml:space="preserve">A7. </w:t>
+        <w:t xml:space="preserve">A186. </w:t>
       </w:r>
       <w:r>
         <w:rPr>
@@ -10279,7 +10279,7 @@
           <w:color w:val="007D38"/>
           <w:sz w:val="21"/>
         </w:rPr>
-        <w:t xml:space="preserve">Q8. </w:t>
+        <w:t xml:space="preserve">Q187. </w:t>
       </w:r>
       <w:r>
         <w:rPr>
@@ -10300,7 +10300,7 @@
           <w:color w:val="007D38"/>
           <w:sz w:val="21"/>
         </w:rPr>
-        <w:t xml:space="preserve">A8. </w:t>
+        <w:t xml:space="preserve">A187. </w:t>
       </w:r>
       <w:r>
         <w:rPr>
@@ -10320,7 +10320,7 @@
           <w:color w:val="007D38"/>
           <w:sz w:val="21"/>
         </w:rPr>
-        <w:t xml:space="preserve">Q9. </w:t>
+        <w:t xml:space="preserve">Q188. </w:t>
       </w:r>
       <w:r>
         <w:rPr>
@@ -10341,7 +10341,7 @@
           <w:color w:val="007D38"/>
           <w:sz w:val="21"/>
         </w:rPr>
-        <w:t xml:space="preserve">A9. </w:t>
+        <w:t xml:space="preserve">A188. </w:t>
       </w:r>
       <w:r>
         <w:rPr>
@@ -10361,7 +10361,7 @@
           <w:color w:val="007D38"/>
           <w:sz w:val="21"/>
         </w:rPr>
-        <w:t xml:space="preserve">Q10. </w:t>
+        <w:t xml:space="preserve">Q189. </w:t>
       </w:r>
       <w:r>
         <w:rPr>
@@ -10382,7 +10382,7 @@
           <w:color w:val="007D38"/>
           <w:sz w:val="21"/>
         </w:rPr>
-        <w:t xml:space="preserve">A10. </w:t>
+        <w:t xml:space="preserve">A189. </w:t>
       </w:r>
       <w:r>
         <w:rPr>
@@ -10402,7 +10402,7 @@
           <w:color w:val="007D38"/>
           <w:sz w:val="21"/>
         </w:rPr>
-        <w:t xml:space="preserve">Q11. </w:t>
+        <w:t xml:space="preserve">Q190. </w:t>
       </w:r>
       <w:r>
         <w:rPr>
@@ -10423,7 +10423,7 @@
           <w:color w:val="007D38"/>
           <w:sz w:val="21"/>
         </w:rPr>
-        <w:t xml:space="preserve">A11. </w:t>
+        <w:t xml:space="preserve">A190. </w:t>
       </w:r>
       <w:r>
         <w:rPr>
@@ -10443,7 +10443,7 @@
           <w:color w:val="007D38"/>
           <w:sz w:val="21"/>
         </w:rPr>
-        <w:t xml:space="preserve">Q12. </w:t>
+        <w:t xml:space="preserve">Q191. </w:t>
       </w:r>
       <w:r>
         <w:rPr>
@@ -10464,7 +10464,7 @@
           <w:color w:val="007D38"/>
           <w:sz w:val="21"/>
         </w:rPr>
-        <w:t xml:space="preserve">A12. </w:t>
+        <w:t xml:space="preserve">A191. </w:t>
       </w:r>
       <w:r>
         <w:rPr>

</xml_diff>